<commit_message>
docs: sync updated week 2 word report
</commit_message>
<xml_diff>
--- a/report/report_week2.docx
+++ b/report/report_week2.docx
@@ -1,14 +1,13 @@
 
 <file path=word/document.xml><?xml version="1.0" encoding="utf-8"?>
-<w:document xmlns:w="http://schemas.openxmlformats.org/wordprocessingml/2006/main">
+<w:document xmlns:wpc="http://schemas.microsoft.com/office/word/2010/wordprocessingCanvas" xmlns:cx="http://schemas.microsoft.com/office/drawing/2014/chartex" xmlns:cx1="http://schemas.microsoft.com/office/drawing/2015/9/8/chartex" xmlns:cx2="http://schemas.microsoft.com/office/drawing/2015/10/21/chartex" xmlns:cx3="http://schemas.microsoft.com/office/drawing/2016/5/9/chartex" xmlns:cx4="http://schemas.microsoft.com/office/drawing/2016/5/10/chartex" xmlns:cx5="http://schemas.microsoft.com/office/drawing/2016/5/11/chartex" xmlns:cx6="http://schemas.microsoft.com/office/drawing/2016/5/12/chartex" xmlns:cx7="http://schemas.microsoft.com/office/drawing/2016/5/13/chartex" xmlns:cx8="http://schemas.microsoft.com/office/drawing/2016/5/14/chartex" xmlns:mc="http://schemas.openxmlformats.org/markup-compatibility/2006" xmlns:aink="http://schemas.microsoft.com/office/drawing/2016/ink" xmlns:am3d="http://schemas.microsoft.com/office/drawing/2017/model3d" xmlns:o="urn:schemas-microsoft-com:office:office" xmlns:oel="http://schemas.microsoft.com/office/2019/extlst" xmlns:r="http://schemas.openxmlformats.org/officeDocument/2006/relationships" xmlns:m="http://schemas.openxmlformats.org/officeDocument/2006/math" xmlns:v="urn:schemas-microsoft-com:vml" xmlns:wp14="http://schemas.microsoft.com/office/word/2010/wordprocessingDrawing" xmlns:wp="http://schemas.openxmlformats.org/drawingml/2006/wordprocessingDrawing" xmlns:w10="urn:schemas-microsoft-com:office:word" xmlns:w="http://schemas.openxmlformats.org/wordprocessingml/2006/main" xmlns:w14="http://schemas.microsoft.com/office/word/2010/wordml" xmlns:w15="http://schemas.microsoft.com/office/word/2012/wordml" xmlns:w16cex="http://schemas.microsoft.com/office/word/2018/wordml/cex" xmlns:w16cid="http://schemas.microsoft.com/office/word/2016/wordml/cid" xmlns:w16="http://schemas.microsoft.com/office/word/2018/wordml" xmlns:w16du="http://schemas.microsoft.com/office/word/2023/wordml/word16du" xmlns:w16sdtdh="http://schemas.microsoft.com/office/word/2020/wordml/sdtdatahash" xmlns:w16sdtfl="http://schemas.microsoft.com/office/word/2024/wordml/sdtformatlock" xmlns:w16se="http://schemas.microsoft.com/office/word/2015/wordml/symex" xmlns:wpg="http://schemas.microsoft.com/office/word/2010/wordprocessingGroup" xmlns:wpi="http://schemas.microsoft.com/office/word/2010/wordprocessingInk" xmlns:wne="http://schemas.microsoft.com/office/word/2006/wordml" xmlns:wps="http://schemas.microsoft.com/office/word/2010/wordprocessingShape" mc:Ignorable="w14 w15 w16se w16cid w16 w16cex w16sdtdh w16sdtfl w16du wp14">
   <w:body>
     <w:p>
       <w:pPr>
-        <w:spacing w:before="0" w:after="80"/>
-      </w:pPr>
-      <w:r>
-        <w:rPr>
-          <w:rFonts w:ascii="Calibri" w:hAnsi="Calibri"/>
+        <w:spacing w:after="80"/>
+      </w:pPr>
+      <w:r>
+        <w:rPr>
           <w:b/>
           <w:color w:val="1E40AF"/>
           <w:sz w:val="20"/>
@@ -18,11 +17,10 @@
     </w:p>
     <w:p>
       <w:pPr>
-        <w:spacing w:before="0" w:after="60"/>
-      </w:pPr>
-      <w:r>
-        <w:rPr>
-          <w:rFonts w:ascii="Calibri" w:hAnsi="Calibri"/>
+        <w:spacing w:after="60"/>
+      </w:pPr>
+      <w:r>
+        <w:rPr>
           <w:b/>
           <w:color w:val="0F172A"/>
           <w:sz w:val="48"/>
@@ -32,11 +30,10 @@
     </w:p>
     <w:p>
       <w:pPr>
-        <w:spacing w:before="0" w:after="240"/>
-      </w:pPr>
-      <w:r>
-        <w:rPr>
-          <w:rFonts w:ascii="Calibri" w:hAnsi="Calibri"/>
+        <w:spacing w:after="240"/>
+      </w:pPr>
+      <w:r>
+        <w:rPr>
           <w:color w:val="475569"/>
           <w:sz w:val="24"/>
         </w:rPr>
@@ -50,43 +47,67 @@
         </w:pBdr>
         <w:spacing w:after="280"/>
       </w:pPr>
+      <w:proofErr w:type="spellStart"/>
+      <w:proofErr w:type="gramStart"/>
       <w:r>
         <w:rPr>
           <w:b/>
           <w:color w:val="1F2937"/>
           <w:sz w:val="20"/>
         </w:rPr>
-        <w:t>Candidate: </w:t>
+        <w:t>Candidate:</w:t>
       </w:r>
       <w:r>
         <w:rPr>
           <w:color w:val="4B5563"/>
           <w:sz w:val="20"/>
         </w:rPr>
-        <w:t xml:space="preserve">Ashish Ranjan Singh    |    </w:t>
-      </w:r>
+        <w:t>Ashish</w:t>
+      </w:r>
+      <w:proofErr w:type="spellEnd"/>
+      <w:proofErr w:type="gramEnd"/>
+      <w:r>
+        <w:rPr>
+          <w:color w:val="4B5563"/>
+          <w:sz w:val="20"/>
+        </w:rPr>
+        <w:t xml:space="preserve"> Ranjan Singh    |    </w:t>
+      </w:r>
+      <w:proofErr w:type="spellStart"/>
+      <w:proofErr w:type="gramStart"/>
       <w:r>
         <w:rPr>
           <w:b/>
           <w:color w:val="1F2937"/>
           <w:sz w:val="20"/>
         </w:rPr>
-        <w:t>Assignment: </w:t>
+        <w:t>Assignment:</w:t>
       </w:r>
       <w:r>
         <w:rPr>
           <w:color w:val="4B5563"/>
           <w:sz w:val="20"/>
         </w:rPr>
-        <w:t xml:space="preserve">Week 2    |    </w:t>
-      </w:r>
+        <w:t>Week</w:t>
+      </w:r>
+      <w:proofErr w:type="spellEnd"/>
+      <w:proofErr w:type="gramEnd"/>
+      <w:r>
+        <w:rPr>
+          <w:color w:val="4B5563"/>
+          <w:sz w:val="20"/>
+        </w:rPr>
+        <w:t xml:space="preserve"> 2    |    </w:t>
+      </w:r>
+      <w:proofErr w:type="spellStart"/>
+      <w:proofErr w:type="gramStart"/>
       <w:r>
         <w:rPr>
           <w:b/>
           <w:color w:val="1F2937"/>
           <w:sz w:val="20"/>
         </w:rPr>
-        <w:t>Status: </w:t>
+        <w:t>Status:</w:t>
       </w:r>
       <w:r>
         <w:rPr>
@@ -94,17 +115,25 @@
           <w:color w:val="059669"/>
           <w:sz w:val="20"/>
         </w:rPr>
-        <w:t>Completed &amp; Verified</w:t>
+        <w:t>Completed</w:t>
+      </w:r>
+      <w:proofErr w:type="spellEnd"/>
+      <w:proofErr w:type="gramEnd"/>
+      <w:r>
+        <w:rPr>
+          <w:b/>
+          <w:color w:val="059669"/>
+          <w:sz w:val="20"/>
+        </w:rPr>
+        <w:t xml:space="preserve"> &amp; Verified</w:t>
       </w:r>
     </w:p>
     <w:p>
       <w:pPr>
-        <w:pStyle w:val="Heading1"/>
         <w:spacing w:before="280" w:after="120"/>
       </w:pPr>
       <w:r>
         <w:rPr>
-          <w:rFonts w:ascii="Calibri" w:hAnsi="Calibri"/>
           <w:b/>
           <w:color w:val="1E3A8A"/>
           <w:sz w:val="32"/>
@@ -118,9 +147,7 @@
       </w:pPr>
       <w:r>
         <w:rPr>
-          <w:rFonts w:ascii="Calibri" w:hAnsi="Calibri"/>
           <w:color w:val="374151"/>
-          <w:sz w:val="22"/>
         </w:rPr>
         <w:t>This technical project report documents the design, architecture, implementation, and accessibility audit of the Week 2 deliverable for the Junior Frontend Developer Internship at Yuva Intern (https://yuvaintern.com/my-internships). The objective was to engineer a reusable, production-ready suite of interactive frontend web components—named 'Nova UI Toolkit'—incorporating Accessible Modal Dialogs, WAI-ARIA Tabbed Switchers, Collapsible FAQ Accordions, and a Dynamic Toast Notification System. All components are built using pure native Vanilla JavaScript (ES6+), modern CSS3, and HTML5 without any third-party framework dependencies.</w:t>
       </w:r>
@@ -128,6 +155,7 @@
     <w:tbl>
       <w:tblPr>
         <w:tblW w:w="9200" w:type="dxa"/>
+        <w:tblInd w:w="180" w:type="dxa"/>
         <w:tblBorders>
           <w:top w:val="single" w:sz="6" w:space="0" w:color="3B82F6"/>
           <w:left w:val="single" w:sz="24" w:space="0" w:color="2563EB"/>
@@ -140,7 +168,11 @@
           <w:bottom w:w="120" w:type="dxa"/>
           <w:right w:w="180" w:type="dxa"/>
         </w:tblCellMar>
+        <w:tblLook w:val="04A0" w:firstRow="1" w:lastRow="0" w:firstColumn="1" w:lastColumn="0" w:noHBand="0" w:noVBand="1"/>
       </w:tblPr>
+      <w:tblGrid>
+        <w:gridCol w:w="9200"/>
+      </w:tblGrid>
       <w:tr>
         <w:tc>
           <w:tcPr>
@@ -163,16 +195,45 @@
           <w:p>
             <w:pPr>
               <w:spacing w:after="40"/>
-            </w:pPr>
-            <w:r>
               <w:rPr>
                 <w:color w:val="1E3A8A"/>
                 <w:sz w:val="20"/>
               </w:rPr>
-              <w:t>Student Name: Ashish Ranjan Singh
-Internship Period: 5 Weeks (07-Jul-2026 to 11-Aug-2026)
-GitHub Repository: https://github.com/ASHISH-7142023/Yuva-Week2-Interactive-Components
-Evaluation Status: Complete &amp; Verified (Week 2 of 5)</w:t>
+            </w:pPr>
+            <w:r>
+              <w:rPr>
+                <w:color w:val="1E3A8A"/>
+                <w:sz w:val="20"/>
+              </w:rPr>
+              <w:t xml:space="preserve">Student Name: Ashish Ranjan Singh Internship Period: 5 Weeks (07-Jul-2026 to 11-Aug-2026) </w:t>
+            </w:r>
+          </w:p>
+          <w:p>
+            <w:pPr>
+              <w:spacing w:after="40"/>
+              <w:rPr>
+                <w:color w:val="1E3A8A"/>
+                <w:sz w:val="20"/>
+              </w:rPr>
+            </w:pPr>
+            <w:r>
+              <w:rPr>
+                <w:color w:val="1E3A8A"/>
+                <w:sz w:val="20"/>
+              </w:rPr>
+              <w:t xml:space="preserve">GitHub Repository: https://github.com/ASHISH-7142023/Yuva-Week2-Interactive-Components </w:t>
+            </w:r>
+          </w:p>
+          <w:p>
+            <w:pPr>
+              <w:spacing w:after="40"/>
+            </w:pPr>
+            <w:r>
+              <w:rPr>
+                <w:color w:val="1E3A8A"/>
+                <w:sz w:val="20"/>
+              </w:rPr>
+              <w:t>Evaluation Status: Complete &amp; Verified (Week 2 of 5)</w:t>
             </w:r>
           </w:p>
         </w:tc>
@@ -185,12 +246,10 @@
     </w:p>
     <w:p>
       <w:pPr>
-        <w:pStyle w:val="Heading1"/>
         <w:spacing w:before="280" w:after="120"/>
       </w:pPr>
       <w:r>
         <w:rPr>
-          <w:rFonts w:ascii="Calibri" w:hAnsi="Calibri"/>
           <w:b/>
           <w:color w:val="1E3A8A"/>
           <w:sz w:val="32"/>
@@ -204,21 +263,17 @@
       </w:pPr>
       <w:r>
         <w:rPr>
-          <w:rFonts w:ascii="Calibri" w:hAnsi="Calibri"/>
           <w:color w:val="374151"/>
-          <w:sz w:val="22"/>
         </w:rPr>
         <w:t>To ensure modularity and long-term reusability, Nova UI Toolkit is organized using a clean, class-based object-oriented structure. Each component is encapsulated within its own dedicated controller class managing private state, DOM references, and event listeners.</w:t>
       </w:r>
     </w:p>
     <w:p>
       <w:pPr>
-        <w:pStyle w:val="Heading2"/>
         <w:spacing w:before="200" w:after="80"/>
       </w:pPr>
       <w:r>
         <w:rPr>
-          <w:rFonts w:ascii="Calibri" w:hAnsi="Calibri"/>
           <w:b/>
           <w:color w:val="2563EB"/>
           <w:sz w:val="26"/>
@@ -228,160 +283,227 @@
     </w:p>
     <w:p>
       <w:pPr>
-        <w:pStyle w:val="ListParagraph"/>
         <w:spacing w:after="80"/>
         <w:ind w:left="360"/>
       </w:pPr>
       <w:r>
         <w:rPr>
+          <w:b/>
           <w:color w:val="2563EB"/>
-          <w:b/>
         </w:rPr>
         <w:t xml:space="preserve">•  </w:t>
       </w:r>
+      <w:proofErr w:type="spellStart"/>
       <w:r>
         <w:rPr>
           <w:b/>
           <w:color w:val="1F2937"/>
-          <w:sz w:val="22"/>
-        </w:rPr>
-        <w:t xml:space="preserve">ModalManager: </w:t>
-      </w:r>
-      <w:r>
-        <w:rPr>
-          <w:rFonts w:ascii="Calibri" w:hAnsi="Calibri"/>
+        </w:rPr>
+        <w:t>ModalManager</w:t>
+      </w:r>
+      <w:proofErr w:type="spellEnd"/>
+      <w:r>
+        <w:rPr>
+          <w:b/>
+          <w:color w:val="1F2937"/>
+        </w:rPr>
+        <w:t xml:space="preserve">: </w:t>
+      </w:r>
+      <w:r>
+        <w:rPr>
           <w:color w:val="4B5563"/>
-          <w:sz w:val="22"/>
-        </w:rPr>
-        <w:t>Controls modal dialog lifecycles, focus trapping, Escape key dismiss, and focus restoration.</w:t>
+        </w:rPr>
+        <w:t xml:space="preserve">Controls modal dialog lifecycles, focus trapping, Escape key </w:t>
+      </w:r>
+      <w:proofErr w:type="gramStart"/>
+      <w:r>
+        <w:rPr>
+          <w:color w:val="4B5563"/>
+        </w:rPr>
+        <w:t>dismiss</w:t>
+      </w:r>
+      <w:proofErr w:type="gramEnd"/>
+      <w:r>
+        <w:rPr>
+          <w:color w:val="4B5563"/>
+        </w:rPr>
+        <w:t>, and focus restoration.</w:t>
       </w:r>
     </w:p>
     <w:p>
       <w:pPr>
-        <w:pStyle w:val="ListParagraph"/>
         <w:spacing w:after="80"/>
         <w:ind w:left="360"/>
       </w:pPr>
       <w:r>
         <w:rPr>
+          <w:b/>
           <w:color w:val="2563EB"/>
-          <w:b/>
         </w:rPr>
         <w:t xml:space="preserve">•  </w:t>
       </w:r>
+      <w:proofErr w:type="spellStart"/>
       <w:r>
         <w:rPr>
           <w:b/>
           <w:color w:val="1F2937"/>
-          <w:sz w:val="22"/>
-        </w:rPr>
-        <w:t xml:space="preserve">TabsManager: </w:t>
-      </w:r>
-      <w:r>
-        <w:rPr>
-          <w:rFonts w:ascii="Calibri" w:hAnsi="Calibri"/>
+        </w:rPr>
+        <w:t>TabsManager</w:t>
+      </w:r>
+      <w:proofErr w:type="spellEnd"/>
+      <w:r>
+        <w:rPr>
+          <w:b/>
+          <w:color w:val="1F2937"/>
+        </w:rPr>
+        <w:t xml:space="preserve">: </w:t>
+      </w:r>
+      <w:r>
+        <w:rPr>
           <w:color w:val="4B5563"/>
-          <w:sz w:val="22"/>
-        </w:rPr>
-        <w:t>Implements WAI-ARIA tablist semantics, roving tabindex, arrow key navigation, and panel visibility.</w:t>
+        </w:rPr>
+        <w:t xml:space="preserve">Implements WAI-ARIA </w:t>
+      </w:r>
+      <w:proofErr w:type="spellStart"/>
+      <w:r>
+        <w:rPr>
+          <w:color w:val="4B5563"/>
+        </w:rPr>
+        <w:t>tablist</w:t>
+      </w:r>
+      <w:proofErr w:type="spellEnd"/>
+      <w:r>
+        <w:rPr>
+          <w:color w:val="4B5563"/>
+        </w:rPr>
+        <w:t xml:space="preserve"> semantics, roving </w:t>
+      </w:r>
+      <w:proofErr w:type="spellStart"/>
+      <w:r>
+        <w:rPr>
+          <w:color w:val="4B5563"/>
+        </w:rPr>
+        <w:t>tabindex</w:t>
+      </w:r>
+      <w:proofErr w:type="spellEnd"/>
+      <w:r>
+        <w:rPr>
+          <w:color w:val="4B5563"/>
+        </w:rPr>
+        <w:t>, arrow key navigation, and panel visibility.</w:t>
       </w:r>
     </w:p>
     <w:p>
       <w:pPr>
-        <w:pStyle w:val="ListParagraph"/>
         <w:spacing w:after="80"/>
         <w:ind w:left="360"/>
       </w:pPr>
       <w:r>
         <w:rPr>
+          <w:b/>
           <w:color w:val="2563EB"/>
-          <w:b/>
         </w:rPr>
         <w:t xml:space="preserve">•  </w:t>
       </w:r>
+      <w:proofErr w:type="spellStart"/>
       <w:r>
         <w:rPr>
           <w:b/>
           <w:color w:val="1F2937"/>
-          <w:sz w:val="22"/>
-        </w:rPr>
-        <w:t xml:space="preserve">AccordionManager: </w:t>
-      </w:r>
-      <w:r>
-        <w:rPr>
-          <w:rFonts w:ascii="Calibri" w:hAnsi="Calibri"/>
+        </w:rPr>
+        <w:t>AccordionManager</w:t>
+      </w:r>
+      <w:proofErr w:type="spellEnd"/>
+      <w:r>
+        <w:rPr>
+          <w:b/>
+          <w:color w:val="1F2937"/>
+        </w:rPr>
+        <w:t xml:space="preserve">: </w:t>
+      </w:r>
+      <w:r>
+        <w:rPr>
           <w:color w:val="4B5563"/>
-          <w:sz w:val="22"/>
         </w:rPr>
         <w:t>Controls collapsible panel transitions via CSS Grid rows, Single/Multi mode toggling, and header keyboard cycling.</w:t>
       </w:r>
     </w:p>
     <w:p>
       <w:pPr>
-        <w:pStyle w:val="ListParagraph"/>
         <w:spacing w:after="80"/>
         <w:ind w:left="360"/>
       </w:pPr>
       <w:r>
         <w:rPr>
+          <w:b/>
           <w:color w:val="2563EB"/>
-          <w:b/>
         </w:rPr>
         <w:t xml:space="preserve">•  </w:t>
       </w:r>
+      <w:proofErr w:type="spellStart"/>
       <w:r>
         <w:rPr>
           <w:b/>
           <w:color w:val="1F2937"/>
-          <w:sz w:val="22"/>
-        </w:rPr>
-        <w:t xml:space="preserve">ToastNotificationService: </w:t>
-      </w:r>
-      <w:r>
-        <w:rPr>
-          <w:rFonts w:ascii="Calibri" w:hAnsi="Calibri"/>
+        </w:rPr>
+        <w:t>ToastNotificationService</w:t>
+      </w:r>
+      <w:proofErr w:type="spellEnd"/>
+      <w:r>
+        <w:rPr>
+          <w:b/>
+          <w:color w:val="1F2937"/>
+        </w:rPr>
+        <w:t xml:space="preserve">: </w:t>
+      </w:r>
+      <w:r>
+        <w:rPr>
           <w:color w:val="4B5563"/>
-          <w:sz w:val="22"/>
         </w:rPr>
         <w:t>Singleton service managing stackable notifications, progress bar countdowns, auto-dismiss, and aria-live announcements.</w:t>
       </w:r>
     </w:p>
     <w:p>
       <w:pPr>
-        <w:pStyle w:val="Heading1"/>
         <w:spacing w:before="280" w:after="120"/>
-      </w:pPr>
-      <w:r>
-        <w:rPr>
-          <w:rFonts w:ascii="Calibri" w:hAnsi="Calibri"/>
+        <w:rPr>
           <w:b/>
           <w:color w:val="1E3A8A"/>
           <w:sz w:val="32"/>
         </w:rPr>
-        <w:t>3. WAI-ARIA 1.2 &amp; Focus Management Implementation</w:t>
-      </w:r>
+      </w:pPr>
     </w:p>
     <w:p>
       <w:pPr>
-        <w:spacing w:after="120" w:line="276" w:lineRule="auto"/>
-      </w:pPr>
-      <w:r>
-        <w:rPr>
-          <w:rFonts w:ascii="Calibri" w:hAnsi="Calibri"/>
-          <w:color w:val="374151"/>
-          <w:sz w:val="22"/>
-        </w:rPr>
-        <w:t>Accessibility was treated as a foundational requirement rather than an afterthought. The components strictly implement authoring practices recommended by the W3C WAI-ARIA 1.2 specifications.</w:t>
+        <w:spacing w:before="280" w:after="120"/>
+      </w:pPr>
+      <w:r>
+        <w:rPr>
+          <w:b/>
+          <w:color w:val="1E3A8A"/>
+          <w:sz w:val="32"/>
+        </w:rPr>
+        <w:lastRenderedPageBreak/>
+        <w:t>3. WAI-ARIA 1.2 &amp; Focus Management Implementation</w:t>
       </w:r>
     </w:p>
     <w:p>
       <w:pPr>
-        <w:pStyle w:val="Heading2"/>
+        <w:spacing w:after="120" w:line="276" w:lineRule="auto"/>
+      </w:pPr>
+      <w:r>
+        <w:rPr>
+          <w:color w:val="374151"/>
+        </w:rPr>
+        <w:t>Accessibility was treated as a foundational requirement rather than an afterthought. The components strictly implement authoring practices recommended by the W3C WAI-ARIA 1.2 specifications.</w:t>
+      </w:r>
+    </w:p>
+    <w:p>
+      <w:pPr>
         <w:spacing w:before="200" w:after="80"/>
       </w:pPr>
       <w:r>
         <w:rPr>
-          <w:rFonts w:ascii="Calibri" w:hAnsi="Calibri"/>
           <w:b/>
           <w:color w:val="2563EB"/>
           <w:sz w:val="26"/>
@@ -395,26 +517,96 @@
       </w:pPr>
       <w:r>
         <w:rPr>
-          <w:rFonts w:ascii="Calibri" w:hAnsi="Calibri"/>
           <w:color w:val="374151"/>
-          <w:sz w:val="22"/>
-        </w:rPr>
-        <w:t>When a modal is opened, ModalManager queries all keyboard-focusable child nodes (buttons, anchors, inputs, textareas). A keydown handler monitors Tab events. If a user tabs forward while focused on the last interactive node, the handler prevents the default browser behavior and forces focus to the first interactive node. If Shift+Tab is pressed on the first node, focus loops to the last node. Upon modal closure, focus is programmatically restored to the original button that triggered the modal.</w:t>
+        </w:rPr>
+        <w:t xml:space="preserve">When a modal is opened, </w:t>
+      </w:r>
+      <w:proofErr w:type="spellStart"/>
+      <w:r>
+        <w:rPr>
+          <w:color w:val="374151"/>
+        </w:rPr>
+        <w:t>ModalManager</w:t>
+      </w:r>
+      <w:proofErr w:type="spellEnd"/>
+      <w:r>
+        <w:rPr>
+          <w:color w:val="374151"/>
+        </w:rPr>
+        <w:t xml:space="preserve"> queries all keyboard-focusable child nodes (buttons, anchors, inputs, </w:t>
+      </w:r>
+      <w:proofErr w:type="spellStart"/>
+      <w:r>
+        <w:rPr>
+          <w:color w:val="374151"/>
+        </w:rPr>
+        <w:t>textareas</w:t>
+      </w:r>
+      <w:proofErr w:type="spellEnd"/>
+      <w:r>
+        <w:rPr>
+          <w:color w:val="374151"/>
+        </w:rPr>
+        <w:t xml:space="preserve">). A </w:t>
+      </w:r>
+      <w:proofErr w:type="spellStart"/>
+      <w:r>
+        <w:rPr>
+          <w:color w:val="374151"/>
+        </w:rPr>
+        <w:t>keydown</w:t>
+      </w:r>
+      <w:proofErr w:type="spellEnd"/>
+      <w:r>
+        <w:rPr>
+          <w:color w:val="374151"/>
+        </w:rPr>
+        <w:t xml:space="preserve"> handler monitors Tab events. If a user tabs forward while focused on the last interactive node, the handler prevents the default browser behavior and forces focus to the first interactive node. If </w:t>
+      </w:r>
+      <w:proofErr w:type="spellStart"/>
+      <w:r>
+        <w:rPr>
+          <w:color w:val="374151"/>
+        </w:rPr>
+        <w:t>Shift+Tab</w:t>
+      </w:r>
+      <w:proofErr w:type="spellEnd"/>
+      <w:r>
+        <w:rPr>
+          <w:color w:val="374151"/>
+        </w:rPr>
+        <w:t xml:space="preserve"> is pressed on the first node, focus loops to the last node. Upon modal closure, focus is programmatically restored to the original button that triggered the modal.</w:t>
       </w:r>
     </w:p>
     <w:p>
       <w:pPr>
-        <w:pStyle w:val="Heading2"/>
         <w:spacing w:before="200" w:after="80"/>
       </w:pPr>
       <w:r>
         <w:rPr>
-          <w:rFonts w:ascii="Calibri" w:hAnsi="Calibri"/>
           <w:b/>
           <w:color w:val="2563EB"/>
           <w:sz w:val="26"/>
         </w:rPr>
-        <w:t>3.2 Roving Tabindex in Tabs</w:t>
+        <w:t xml:space="preserve">3.2 Roving </w:t>
+      </w:r>
+      <w:proofErr w:type="spellStart"/>
+      <w:r>
+        <w:rPr>
+          <w:b/>
+          <w:color w:val="2563EB"/>
+          <w:sz w:val="26"/>
+        </w:rPr>
+        <w:t>Tabindex</w:t>
+      </w:r>
+      <w:proofErr w:type="spellEnd"/>
+      <w:r>
+        <w:rPr>
+          <w:b/>
+          <w:color w:val="2563EB"/>
+          <w:sz w:val="26"/>
+        </w:rPr>
+        <w:t xml:space="preserve"> in Tabs</w:t>
       </w:r>
     </w:p>
     <w:p>
@@ -423,21 +615,101 @@
       </w:pPr>
       <w:r>
         <w:rPr>
-          <w:rFonts w:ascii="Calibri" w:hAnsi="Calibri"/>
           <w:color w:val="374151"/>
-          <w:sz w:val="22"/>
-        </w:rPr>
-        <w:t>Standard HTML tablists can cause excessive tabbing fatigue if all tabs remain in the tab order. Nova UI applies a roving tabindex pattern: only the currently active tab has tabindex='0', while all inactive sibling tabs carry tabindex='-1'. Keyboard users navigate between tabs using ArrowLeft and ArrowRight keys, which automatically transfers active selection and updates aria-selected attributes.</w:t>
+        </w:rPr>
+        <w:t xml:space="preserve">Standard HTML </w:t>
+      </w:r>
+      <w:proofErr w:type="spellStart"/>
+      <w:r>
+        <w:rPr>
+          <w:color w:val="374151"/>
+        </w:rPr>
+        <w:t>tablists</w:t>
+      </w:r>
+      <w:proofErr w:type="spellEnd"/>
+      <w:r>
+        <w:rPr>
+          <w:color w:val="374151"/>
+        </w:rPr>
+        <w:t xml:space="preserve"> can cause excessive tabbing fatigue if all tabs remain in the tab order. Nova UI applies a roving </w:t>
+      </w:r>
+      <w:proofErr w:type="spellStart"/>
+      <w:r>
+        <w:rPr>
+          <w:color w:val="374151"/>
+        </w:rPr>
+        <w:t>tabindex</w:t>
+      </w:r>
+      <w:proofErr w:type="spellEnd"/>
+      <w:r>
+        <w:rPr>
+          <w:color w:val="374151"/>
+        </w:rPr>
+        <w:t xml:space="preserve"> pattern: only the currently active tab has </w:t>
+      </w:r>
+      <w:proofErr w:type="spellStart"/>
+      <w:r>
+        <w:rPr>
+          <w:color w:val="374151"/>
+        </w:rPr>
+        <w:t>tabindex</w:t>
+      </w:r>
+      <w:proofErr w:type="spellEnd"/>
+      <w:r>
+        <w:rPr>
+          <w:color w:val="374151"/>
+        </w:rPr>
+        <w:t xml:space="preserve">='0', while all inactive sibling tabs carry </w:t>
+      </w:r>
+      <w:proofErr w:type="spellStart"/>
+      <w:r>
+        <w:rPr>
+          <w:color w:val="374151"/>
+        </w:rPr>
+        <w:t>tabindex</w:t>
+      </w:r>
+      <w:proofErr w:type="spellEnd"/>
+      <w:r>
+        <w:rPr>
+          <w:color w:val="374151"/>
+        </w:rPr>
+        <w:t xml:space="preserve">='-1'. Keyboard users navigate between tabs using </w:t>
+      </w:r>
+      <w:proofErr w:type="spellStart"/>
+      <w:r>
+        <w:rPr>
+          <w:color w:val="374151"/>
+        </w:rPr>
+        <w:t>ArrowLeft</w:t>
+      </w:r>
+      <w:proofErr w:type="spellEnd"/>
+      <w:r>
+        <w:rPr>
+          <w:color w:val="374151"/>
+        </w:rPr>
+        <w:t xml:space="preserve"> and </w:t>
+      </w:r>
+      <w:proofErr w:type="spellStart"/>
+      <w:r>
+        <w:rPr>
+          <w:color w:val="374151"/>
+        </w:rPr>
+        <w:t>ArrowRight</w:t>
+      </w:r>
+      <w:proofErr w:type="spellEnd"/>
+      <w:r>
+        <w:rPr>
+          <w:color w:val="374151"/>
+        </w:rPr>
+        <w:t xml:space="preserve"> keys, which automatically transfers active selection and updates aria-selected attributes.</w:t>
       </w:r>
     </w:p>
     <w:p>
       <w:pPr>
-        <w:pStyle w:val="Heading2"/>
         <w:spacing w:before="200" w:after="80"/>
       </w:pPr>
       <w:r>
         <w:rPr>
-          <w:rFonts w:ascii="Calibri" w:hAnsi="Calibri"/>
           <w:b/>
           <w:color w:val="2563EB"/>
           <w:sz w:val="26"/>
@@ -451,21 +723,17 @@
       </w:pPr>
       <w:r>
         <w:rPr>
-          <w:rFonts w:ascii="Calibri" w:hAnsi="Calibri"/>
           <w:color w:val="374151"/>
-          <w:sz w:val="22"/>
         </w:rPr>
         <w:t>Toast notifications are rendered inside a dedicated &lt;aside id='toast-container'&gt; element carrying role='status', aria-live='polite', and aria-atomic='true'. This ensures that screen readers announce the alert content naturally during the next conversational pause without disrupting the user's ongoing interaction.</w:t>
       </w:r>
     </w:p>
     <w:p>
       <w:pPr>
-        <w:pStyle w:val="Heading1"/>
         <w:spacing w:before="280" w:after="120"/>
       </w:pPr>
       <w:r>
         <w:rPr>
-          <w:rFonts w:ascii="Calibri" w:hAnsi="Calibri"/>
           <w:b/>
           <w:color w:val="1E3A8A"/>
           <w:sz w:val="32"/>
@@ -476,6 +744,7 @@
     <w:tbl>
       <w:tblPr>
         <w:tblW w:w="9200" w:type="dxa"/>
+        <w:tblInd w:w="120" w:type="dxa"/>
         <w:tblBorders>
           <w:top w:val="single" w:sz="4" w:space="0" w:color="D1D5DB"/>
           <w:left w:val="single" w:sz="4" w:space="0" w:color="D1D5DB"/>
@@ -490,10 +759,18 @@
           <w:bottom w:w="80" w:type="dxa"/>
           <w:right w:w="120" w:type="dxa"/>
         </w:tblCellMar>
+        <w:tblLook w:val="04A0" w:firstRow="1" w:lastRow="0" w:firstColumn="1" w:lastColumn="0" w:noHBand="0" w:noVBand="1"/>
       </w:tblPr>
+      <w:tblGrid>
+        <w:gridCol w:w="1282"/>
+        <w:gridCol w:w="1916"/>
+        <w:gridCol w:w="3351"/>
+        <w:gridCol w:w="2651"/>
+      </w:tblGrid>
       <w:tr>
         <w:tc>
           <w:tcPr>
+            <w:tcW w:w="0" w:type="auto"/>
             <w:shd w:val="clear" w:color="auto" w:fill="1E3A8A"/>
           </w:tcPr>
           <w:p>
@@ -512,6 +789,7 @@
         </w:tc>
         <w:tc>
           <w:tcPr>
+            <w:tcW w:w="0" w:type="auto"/>
             <w:shd w:val="clear" w:color="auto" w:fill="1E3A8A"/>
           </w:tcPr>
           <w:p>
@@ -530,6 +808,7 @@
         </w:tc>
         <w:tc>
           <w:tcPr>
+            <w:tcW w:w="0" w:type="auto"/>
             <w:shd w:val="clear" w:color="auto" w:fill="1E3A8A"/>
           </w:tcPr>
           <w:p>
@@ -548,6 +827,7 @@
         </w:tc>
         <w:tc>
           <w:tcPr>
+            <w:tcW w:w="0" w:type="auto"/>
             <w:shd w:val="clear" w:color="auto" w:fill="1E3A8A"/>
           </w:tcPr>
           <w:p>
@@ -568,6 +848,7 @@
       <w:tr>
         <w:tc>
           <w:tcPr>
+            <w:tcW w:w="0" w:type="auto"/>
             <w:shd w:val="clear" w:color="auto" w:fill="FFFFFF"/>
           </w:tcPr>
           <w:p>
@@ -585,6 +866,7 @@
         </w:tc>
         <w:tc>
           <w:tcPr>
+            <w:tcW w:w="0" w:type="auto"/>
             <w:shd w:val="clear" w:color="auto" w:fill="FFFFFF"/>
           </w:tcPr>
           <w:p>
@@ -596,12 +878,22 @@
                 <w:color w:val="374151"/>
                 <w:sz w:val="20"/>
               </w:rPr>
-              <w:t>Tab / Shift+Tab</w:t>
-            </w:r>
-          </w:p>
-        </w:tc>
-        <w:tc>
-          <w:tcPr>
+              <w:t xml:space="preserve">Tab / </w:t>
+            </w:r>
+            <w:proofErr w:type="spellStart"/>
+            <w:r>
+              <w:rPr>
+                <w:color w:val="374151"/>
+                <w:sz w:val="20"/>
+              </w:rPr>
+              <w:t>Shift+Tab</w:t>
+            </w:r>
+            <w:proofErr w:type="spellEnd"/>
+          </w:p>
+        </w:tc>
+        <w:tc>
+          <w:tcPr>
+            <w:tcW w:w="0" w:type="auto"/>
             <w:shd w:val="clear" w:color="auto" w:fill="FFFFFF"/>
           </w:tcPr>
           <w:p>
@@ -619,6 +911,7 @@
         </w:tc>
         <w:tc>
           <w:tcPr>
+            <w:tcW w:w="0" w:type="auto"/>
             <w:shd w:val="clear" w:color="auto" w:fill="FFFFFF"/>
           </w:tcPr>
           <w:p>
@@ -638,6 +931,7 @@
       <w:tr>
         <w:tc>
           <w:tcPr>
+            <w:tcW w:w="0" w:type="auto"/>
             <w:shd w:val="clear" w:color="auto" w:fill="F9FAFB"/>
           </w:tcPr>
           <w:p>
@@ -655,6 +949,7 @@
         </w:tc>
         <w:tc>
           <w:tcPr>
+            <w:tcW w:w="0" w:type="auto"/>
             <w:shd w:val="clear" w:color="auto" w:fill="F9FAFB"/>
           </w:tcPr>
           <w:p>
@@ -672,6 +967,7 @@
         </w:tc>
         <w:tc>
           <w:tcPr>
+            <w:tcW w:w="0" w:type="auto"/>
             <w:shd w:val="clear" w:color="auto" w:fill="F9FAFB"/>
           </w:tcPr>
           <w:p>
@@ -689,6 +985,7 @@
         </w:tc>
         <w:tc>
           <w:tcPr>
+            <w:tcW w:w="0" w:type="auto"/>
             <w:shd w:val="clear" w:color="auto" w:fill="F9FAFB"/>
           </w:tcPr>
           <w:p>
@@ -708,6 +1005,7 @@
       <w:tr>
         <w:tc>
           <w:tcPr>
+            <w:tcW w:w="0" w:type="auto"/>
             <w:shd w:val="clear" w:color="auto" w:fill="FFFFFF"/>
           </w:tcPr>
           <w:p>
@@ -725,23 +1023,43 @@
         </w:tc>
         <w:tc>
           <w:tcPr>
+            <w:tcW w:w="0" w:type="auto"/>
             <w:shd w:val="clear" w:color="auto" w:fill="FFFFFF"/>
           </w:tcPr>
           <w:p>
             <w:pPr>
               <w:spacing w:before="60" w:after="60"/>
             </w:pPr>
-            <w:r>
-              <w:rPr>
-                <w:color w:val="374151"/>
-                <w:sz w:val="20"/>
-              </w:rPr>
-              <w:t>ArrowRight / ArrowDown</w:t>
-            </w:r>
-          </w:p>
-        </w:tc>
-        <w:tc>
-          <w:tcPr>
+            <w:proofErr w:type="spellStart"/>
+            <w:r>
+              <w:rPr>
+                <w:color w:val="374151"/>
+                <w:sz w:val="20"/>
+              </w:rPr>
+              <w:t>ArrowRight</w:t>
+            </w:r>
+            <w:proofErr w:type="spellEnd"/>
+            <w:r>
+              <w:rPr>
+                <w:color w:val="374151"/>
+                <w:sz w:val="20"/>
+              </w:rPr>
+              <w:t xml:space="preserve"> / </w:t>
+            </w:r>
+            <w:proofErr w:type="spellStart"/>
+            <w:r>
+              <w:rPr>
+                <w:color w:val="374151"/>
+                <w:sz w:val="20"/>
+              </w:rPr>
+              <w:t>ArrowDown</w:t>
+            </w:r>
+            <w:proofErr w:type="spellEnd"/>
+          </w:p>
+        </w:tc>
+        <w:tc>
+          <w:tcPr>
+            <w:tcW w:w="0" w:type="auto"/>
             <w:shd w:val="clear" w:color="auto" w:fill="FFFFFF"/>
           </w:tcPr>
           <w:p>
@@ -759,6 +1077,7 @@
         </w:tc>
         <w:tc>
           <w:tcPr>
+            <w:tcW w:w="0" w:type="auto"/>
             <w:shd w:val="clear" w:color="auto" w:fill="FFFFFF"/>
           </w:tcPr>
           <w:p>
@@ -770,7 +1089,23 @@
                 <w:color w:val="374151"/>
                 <w:sz w:val="20"/>
               </w:rPr>
-              <w:t>aria-selected='true', tabindex='0'</w:t>
+              <w:t xml:space="preserve">aria-selected='true', </w:t>
+            </w:r>
+            <w:proofErr w:type="spellStart"/>
+            <w:r>
+              <w:rPr>
+                <w:color w:val="374151"/>
+                <w:sz w:val="20"/>
+              </w:rPr>
+              <w:t>tabindex</w:t>
+            </w:r>
+            <w:proofErr w:type="spellEnd"/>
+            <w:r>
+              <w:rPr>
+                <w:color w:val="374151"/>
+                <w:sz w:val="20"/>
+              </w:rPr>
+              <w:t>='0'</w:t>
             </w:r>
           </w:p>
         </w:tc>
@@ -778,6 +1113,7 @@
       <w:tr>
         <w:tc>
           <w:tcPr>
+            <w:tcW w:w="0" w:type="auto"/>
             <w:shd w:val="clear" w:color="auto" w:fill="F9FAFB"/>
           </w:tcPr>
           <w:p>
@@ -795,23 +1131,43 @@
         </w:tc>
         <w:tc>
           <w:tcPr>
+            <w:tcW w:w="0" w:type="auto"/>
             <w:shd w:val="clear" w:color="auto" w:fill="F9FAFB"/>
           </w:tcPr>
           <w:p>
             <w:pPr>
               <w:spacing w:before="60" w:after="60"/>
             </w:pPr>
-            <w:r>
-              <w:rPr>
-                <w:color w:val="374151"/>
-                <w:sz w:val="20"/>
-              </w:rPr>
-              <w:t>ArrowLeft / ArrowUp</w:t>
-            </w:r>
-          </w:p>
-        </w:tc>
-        <w:tc>
-          <w:tcPr>
+            <w:proofErr w:type="spellStart"/>
+            <w:r>
+              <w:rPr>
+                <w:color w:val="374151"/>
+                <w:sz w:val="20"/>
+              </w:rPr>
+              <w:t>ArrowLeft</w:t>
+            </w:r>
+            <w:proofErr w:type="spellEnd"/>
+            <w:r>
+              <w:rPr>
+                <w:color w:val="374151"/>
+                <w:sz w:val="20"/>
+              </w:rPr>
+              <w:t xml:space="preserve"> / </w:t>
+            </w:r>
+            <w:proofErr w:type="spellStart"/>
+            <w:r>
+              <w:rPr>
+                <w:color w:val="374151"/>
+                <w:sz w:val="20"/>
+              </w:rPr>
+              <w:t>ArrowUp</w:t>
+            </w:r>
+            <w:proofErr w:type="spellEnd"/>
+          </w:p>
+        </w:tc>
+        <w:tc>
+          <w:tcPr>
+            <w:tcW w:w="0" w:type="auto"/>
             <w:shd w:val="clear" w:color="auto" w:fill="F9FAFB"/>
           </w:tcPr>
           <w:p>
@@ -829,6 +1185,7 @@
         </w:tc>
         <w:tc>
           <w:tcPr>
+            <w:tcW w:w="0" w:type="auto"/>
             <w:shd w:val="clear" w:color="auto" w:fill="F9FAFB"/>
           </w:tcPr>
           <w:p>
@@ -840,7 +1197,23 @@
                 <w:color w:val="374151"/>
                 <w:sz w:val="20"/>
               </w:rPr>
-              <w:t>aria-selected='false', tabindex='-1'</w:t>
+              <w:t xml:space="preserve">aria-selected='false', </w:t>
+            </w:r>
+            <w:proofErr w:type="spellStart"/>
+            <w:r>
+              <w:rPr>
+                <w:color w:val="374151"/>
+                <w:sz w:val="20"/>
+              </w:rPr>
+              <w:t>tabindex</w:t>
+            </w:r>
+            <w:proofErr w:type="spellEnd"/>
+            <w:r>
+              <w:rPr>
+                <w:color w:val="374151"/>
+                <w:sz w:val="20"/>
+              </w:rPr>
+              <w:t>='-1'</w:t>
             </w:r>
           </w:p>
         </w:tc>
@@ -848,6 +1221,7 @@
       <w:tr>
         <w:tc>
           <w:tcPr>
+            <w:tcW w:w="0" w:type="auto"/>
             <w:shd w:val="clear" w:color="auto" w:fill="FFFFFF"/>
           </w:tcPr>
           <w:p>
@@ -859,12 +1233,21 @@
                 <w:color w:val="374151"/>
                 <w:sz w:val="20"/>
               </w:rPr>
-              <w:t>Tab Switcher</w:t>
-            </w:r>
-          </w:p>
-        </w:tc>
-        <w:tc>
-          <w:tcPr>
+              <w:t xml:space="preserve">Tab </w:t>
+            </w:r>
+            <w:r>
+              <w:rPr>
+                <w:color w:val="374151"/>
+                <w:sz w:val="20"/>
+              </w:rPr>
+              <w:lastRenderedPageBreak/>
+              <w:t>Switcher</w:t>
+            </w:r>
+          </w:p>
+        </w:tc>
+        <w:tc>
+          <w:tcPr>
+            <w:tcW w:w="0" w:type="auto"/>
             <w:shd w:val="clear" w:color="auto" w:fill="FFFFFF"/>
           </w:tcPr>
           <w:p>
@@ -876,12 +1259,14 @@
                 <w:color w:val="374151"/>
                 <w:sz w:val="20"/>
               </w:rPr>
+              <w:lastRenderedPageBreak/>
               <w:t>Home / End</w:t>
             </w:r>
           </w:p>
         </w:tc>
         <w:tc>
           <w:tcPr>
+            <w:tcW w:w="0" w:type="auto"/>
             <w:shd w:val="clear" w:color="auto" w:fill="FFFFFF"/>
           </w:tcPr>
           <w:p>
@@ -899,6 +1284,7 @@
         </w:tc>
         <w:tc>
           <w:tcPr>
+            <w:tcW w:w="0" w:type="auto"/>
             <w:shd w:val="clear" w:color="auto" w:fill="FFFFFF"/>
           </w:tcPr>
           <w:p>
@@ -910,7 +1296,15 @@
                 <w:color w:val="374151"/>
                 <w:sz w:val="20"/>
               </w:rPr>
-              <w:t>Focus &amp; aria-selected updated</w:t>
+              <w:t xml:space="preserve">Focus &amp; aria-selected </w:t>
+            </w:r>
+            <w:r>
+              <w:rPr>
+                <w:color w:val="374151"/>
+                <w:sz w:val="20"/>
+              </w:rPr>
+              <w:lastRenderedPageBreak/>
+              <w:t>updated</w:t>
             </w:r>
           </w:p>
         </w:tc>
@@ -918,6 +1312,7 @@
       <w:tr>
         <w:tc>
           <w:tcPr>
+            <w:tcW w:w="0" w:type="auto"/>
             <w:shd w:val="clear" w:color="auto" w:fill="F9FAFB"/>
           </w:tcPr>
           <w:p>
@@ -929,12 +1324,14 @@
                 <w:color w:val="374151"/>
                 <w:sz w:val="20"/>
               </w:rPr>
+              <w:lastRenderedPageBreak/>
               <w:t>Accordion</w:t>
             </w:r>
           </w:p>
         </w:tc>
         <w:tc>
           <w:tcPr>
+            <w:tcW w:w="0" w:type="auto"/>
             <w:shd w:val="clear" w:color="auto" w:fill="F9FAFB"/>
           </w:tcPr>
           <w:p>
@@ -952,6 +1349,7 @@
         </w:tc>
         <w:tc>
           <w:tcPr>
+            <w:tcW w:w="0" w:type="auto"/>
             <w:shd w:val="clear" w:color="auto" w:fill="F9FAFB"/>
           </w:tcPr>
           <w:p>
@@ -969,6 +1367,7 @@
         </w:tc>
         <w:tc>
           <w:tcPr>
+            <w:tcW w:w="0" w:type="auto"/>
             <w:shd w:val="clear" w:color="auto" w:fill="F9FAFB"/>
           </w:tcPr>
           <w:p>
@@ -988,6 +1387,7 @@
       <w:tr>
         <w:tc>
           <w:tcPr>
+            <w:tcW w:w="0" w:type="auto"/>
             <w:shd w:val="clear" w:color="auto" w:fill="FFFFFF"/>
           </w:tcPr>
           <w:p>
@@ -1005,23 +1405,43 @@
         </w:tc>
         <w:tc>
           <w:tcPr>
+            <w:tcW w:w="0" w:type="auto"/>
             <w:shd w:val="clear" w:color="auto" w:fill="FFFFFF"/>
           </w:tcPr>
           <w:p>
             <w:pPr>
               <w:spacing w:before="60" w:after="60"/>
             </w:pPr>
-            <w:r>
-              <w:rPr>
-                <w:color w:val="374151"/>
-                <w:sz w:val="20"/>
-              </w:rPr>
-              <w:t>ArrowDown / ArrowUp</w:t>
-            </w:r>
-          </w:p>
-        </w:tc>
-        <w:tc>
-          <w:tcPr>
+            <w:proofErr w:type="spellStart"/>
+            <w:r>
+              <w:rPr>
+                <w:color w:val="374151"/>
+                <w:sz w:val="20"/>
+              </w:rPr>
+              <w:t>ArrowDown</w:t>
+            </w:r>
+            <w:proofErr w:type="spellEnd"/>
+            <w:r>
+              <w:rPr>
+                <w:color w:val="374151"/>
+                <w:sz w:val="20"/>
+              </w:rPr>
+              <w:t xml:space="preserve"> / </w:t>
+            </w:r>
+            <w:proofErr w:type="spellStart"/>
+            <w:r>
+              <w:rPr>
+                <w:color w:val="374151"/>
+                <w:sz w:val="20"/>
+              </w:rPr>
+              <w:t>ArrowUp</w:t>
+            </w:r>
+            <w:proofErr w:type="spellEnd"/>
+          </w:p>
+        </w:tc>
+        <w:tc>
+          <w:tcPr>
+            <w:tcW w:w="0" w:type="auto"/>
             <w:shd w:val="clear" w:color="auto" w:fill="FFFFFF"/>
           </w:tcPr>
           <w:p>
@@ -1039,6 +1459,7 @@
         </w:tc>
         <w:tc>
           <w:tcPr>
+            <w:tcW w:w="0" w:type="auto"/>
             <w:shd w:val="clear" w:color="auto" w:fill="FFFFFF"/>
           </w:tcPr>
           <w:p>
@@ -1058,6 +1479,7 @@
       <w:tr>
         <w:tc>
           <w:tcPr>
+            <w:tcW w:w="0" w:type="auto"/>
             <w:shd w:val="clear" w:color="auto" w:fill="F9FAFB"/>
           </w:tcPr>
           <w:p>
@@ -1075,6 +1497,7 @@
         </w:tc>
         <w:tc>
           <w:tcPr>
+            <w:tcW w:w="0" w:type="auto"/>
             <w:shd w:val="clear" w:color="auto" w:fill="F9FAFB"/>
           </w:tcPr>
           <w:p>
@@ -1086,12 +1509,22 @@
                 <w:color w:val="374151"/>
                 <w:sz w:val="20"/>
               </w:rPr>
-              <w:t>Hover / Mouseleave</w:t>
-            </w:r>
-          </w:p>
-        </w:tc>
-        <w:tc>
-          <w:tcPr>
+              <w:t xml:space="preserve">Hover / </w:t>
+            </w:r>
+            <w:proofErr w:type="spellStart"/>
+            <w:r>
+              <w:rPr>
+                <w:color w:val="374151"/>
+                <w:sz w:val="20"/>
+              </w:rPr>
+              <w:t>Mouseleave</w:t>
+            </w:r>
+            <w:proofErr w:type="spellEnd"/>
+          </w:p>
+        </w:tc>
+        <w:tc>
+          <w:tcPr>
+            <w:tcW w:w="0" w:type="auto"/>
             <w:shd w:val="clear" w:color="auto" w:fill="F9FAFB"/>
           </w:tcPr>
           <w:p>
@@ -1109,6 +1542,7 @@
         </w:tc>
         <w:tc>
           <w:tcPr>
+            <w:tcW w:w="0" w:type="auto"/>
             <w:shd w:val="clear" w:color="auto" w:fill="F9FAFB"/>
           </w:tcPr>
           <w:p>
@@ -1126,47 +1560,37 @@
         </w:tc>
       </w:tr>
     </w:tbl>
+    <w:p/>
     <w:p>
       <w:pPr>
-        <w:spacing w:after="160"/>
-      </w:pPr>
+        <w:spacing w:before="280" w:after="120"/>
+      </w:pPr>
+      <w:r>
+        <w:rPr>
+          <w:b/>
+          <w:color w:val="1E3A8A"/>
+          <w:sz w:val="32"/>
+        </w:rPr>
+        <w:t>5. CSS3 Transitions &amp; Animation Engineering</w:t>
+      </w:r>
     </w:p>
     <w:p>
       <w:pPr>
-        <w:pStyle w:val="Heading1"/>
-        <w:spacing w:before="280" w:after="120"/>
-      </w:pPr>
-      <w:r>
-        <w:rPr>
-          <w:rFonts w:ascii="Calibri" w:hAnsi="Calibri"/>
-          <w:b/>
-          <w:color w:val="1E3A8A"/>
-          <w:sz w:val="32"/>
-        </w:rPr>
-        <w:t>5. CSS3 Transitions &amp; Animation Engineering</w:t>
+        <w:spacing w:after="120" w:line="276" w:lineRule="auto"/>
+      </w:pPr>
+      <w:r>
+        <w:rPr>
+          <w:color w:val="374151"/>
+        </w:rPr>
+        <w:t>A key technical challenge in accordion development is animating height to an unknown dynamic dimension. Traditional max-height hacks cause jerky animations. Nova UI utilizes CSS Grid row interpolation (grid-template-rows: 0fr to grid-template-rows: 1fr) with overflow: hidden on the child container. This enables GPU-accelerated 60 FPS height transitions that adjust perfectly to dynamic content.</w:t>
       </w:r>
     </w:p>
     <w:p>
       <w:pPr>
-        <w:spacing w:after="120" w:line="276" w:lineRule="auto"/>
-      </w:pPr>
-      <w:r>
-        <w:rPr>
-          <w:rFonts w:ascii="Calibri" w:hAnsi="Calibri"/>
-          <w:color w:val="374151"/>
-          <w:sz w:val="22"/>
-        </w:rPr>
-        <w:t>A key technical challenge in accordion development is animating height to an unknown dynamic dimension. Traditional max-height hacks cause jerky animations. Nova UI utilizes CSS Grid row interpolation (grid-template-rows: 0fr to grid-template-rows: 1fr) with overflow: hidden on the child container. This enables GPU-accelerated 60 FPS height transitions that adjust perfectly to dynamic content.</w:t>
-      </w:r>
-    </w:p>
-    <w:p>
-      <w:pPr>
-        <w:pStyle w:val="Heading1"/>
         <w:spacing w:before="280" w:after="120"/>
       </w:pPr>
       <w:r>
         <w:rPr>
-          <w:rFonts w:ascii="Calibri" w:hAnsi="Calibri"/>
           <w:b/>
           <w:color w:val="1E3A8A"/>
           <w:sz w:val="32"/>
@@ -1177,6 +1601,7 @@
     <w:tbl>
       <w:tblPr>
         <w:tblW w:w="9200" w:type="dxa"/>
+        <w:tblInd w:w="120" w:type="dxa"/>
         <w:tblBorders>
           <w:top w:val="single" w:sz="4" w:space="0" w:color="D1D5DB"/>
           <w:left w:val="single" w:sz="4" w:space="0" w:color="D1D5DB"/>
@@ -1191,10 +1616,18 @@
           <w:bottom w:w="80" w:type="dxa"/>
           <w:right w:w="120" w:type="dxa"/>
         </w:tblCellMar>
+        <w:tblLook w:val="04A0" w:firstRow="1" w:lastRow="0" w:firstColumn="1" w:lastColumn="0" w:noHBand="0" w:noVBand="1"/>
       </w:tblPr>
+      <w:tblGrid>
+        <w:gridCol w:w="1885"/>
+        <w:gridCol w:w="1252"/>
+        <w:gridCol w:w="2184"/>
+        <w:gridCol w:w="3879"/>
+      </w:tblGrid>
       <w:tr>
         <w:tc>
           <w:tcPr>
+            <w:tcW w:w="0" w:type="auto"/>
             <w:shd w:val="clear" w:color="auto" w:fill="1E3A8A"/>
           </w:tcPr>
           <w:p>
@@ -1213,6 +1646,7 @@
         </w:tc>
         <w:tc>
           <w:tcPr>
+            <w:tcW w:w="0" w:type="auto"/>
             <w:shd w:val="clear" w:color="auto" w:fill="1E3A8A"/>
           </w:tcPr>
           <w:p>
@@ -1231,6 +1665,7 @@
         </w:tc>
         <w:tc>
           <w:tcPr>
+            <w:tcW w:w="0" w:type="auto"/>
             <w:shd w:val="clear" w:color="auto" w:fill="1E3A8A"/>
           </w:tcPr>
           <w:p>
@@ -1249,6 +1684,7 @@
         </w:tc>
         <w:tc>
           <w:tcPr>
+            <w:tcW w:w="0" w:type="auto"/>
             <w:shd w:val="clear" w:color="auto" w:fill="1E3A8A"/>
           </w:tcPr>
           <w:p>
@@ -1269,6 +1705,7 @@
       <w:tr>
         <w:tc>
           <w:tcPr>
+            <w:tcW w:w="0" w:type="auto"/>
             <w:shd w:val="clear" w:color="auto" w:fill="FFFFFF"/>
           </w:tcPr>
           <w:p>
@@ -1286,6 +1723,7 @@
         </w:tc>
         <w:tc>
           <w:tcPr>
+            <w:tcW w:w="0" w:type="auto"/>
             <w:shd w:val="clear" w:color="auto" w:fill="FFFFFF"/>
           </w:tcPr>
           <w:p>
@@ -1303,6 +1741,7 @@
         </w:tc>
         <w:tc>
           <w:tcPr>
+            <w:tcW w:w="0" w:type="auto"/>
             <w:shd w:val="clear" w:color="auto" w:fill="FFFFFF"/>
           </w:tcPr>
           <w:p>
@@ -1320,6 +1759,7 @@
         </w:tc>
         <w:tc>
           <w:tcPr>
+            <w:tcW w:w="0" w:type="auto"/>
             <w:shd w:val="clear" w:color="auto" w:fill="FFFFFF"/>
           </w:tcPr>
           <w:p>
@@ -1331,7 +1771,23 @@
                 <w:color w:val="374151"/>
                 <w:sz w:val="20"/>
               </w:rPr>
-              <w:t>Manual Tab/Shift+Tab, Arrow, Esc Key Verification</w:t>
+              <w:t>Manual Tab/</w:t>
+            </w:r>
+            <w:proofErr w:type="spellStart"/>
+            <w:r>
+              <w:rPr>
+                <w:color w:val="374151"/>
+                <w:sz w:val="20"/>
+              </w:rPr>
+              <w:t>Shift+Tab</w:t>
+            </w:r>
+            <w:proofErr w:type="spellEnd"/>
+            <w:r>
+              <w:rPr>
+                <w:color w:val="374151"/>
+                <w:sz w:val="20"/>
+              </w:rPr>
+              <w:t>, Arrow, Esc Key Verification</w:t>
             </w:r>
           </w:p>
         </w:tc>
@@ -1339,6 +1795,7 @@
       <w:tr>
         <w:tc>
           <w:tcPr>
+            <w:tcW w:w="0" w:type="auto"/>
             <w:shd w:val="clear" w:color="auto" w:fill="F9FAFB"/>
           </w:tcPr>
           <w:p>
@@ -1356,6 +1813,7 @@
         </w:tc>
         <w:tc>
           <w:tcPr>
+            <w:tcW w:w="0" w:type="auto"/>
             <w:shd w:val="clear" w:color="auto" w:fill="F9FAFB"/>
           </w:tcPr>
           <w:p>
@@ -1373,6 +1831,7 @@
         </w:tc>
         <w:tc>
           <w:tcPr>
+            <w:tcW w:w="0" w:type="auto"/>
             <w:shd w:val="clear" w:color="auto" w:fill="F9FAFB"/>
           </w:tcPr>
           <w:p>
@@ -1390,6 +1849,7 @@
         </w:tc>
         <w:tc>
           <w:tcPr>
+            <w:tcW w:w="0" w:type="auto"/>
             <w:shd w:val="clear" w:color="auto" w:fill="F9FAFB"/>
           </w:tcPr>
           <w:p>
@@ -1401,7 +1861,23 @@
                 <w:color w:val="374151"/>
                 <w:sz w:val="20"/>
               </w:rPr>
-              <w:t>NVDA / VoiceOver Live Announcement Testing</w:t>
+              <w:t xml:space="preserve">NVDA / </w:t>
+            </w:r>
+            <w:proofErr w:type="spellStart"/>
+            <w:r>
+              <w:rPr>
+                <w:color w:val="374151"/>
+                <w:sz w:val="20"/>
+              </w:rPr>
+              <w:t>VoiceOver</w:t>
+            </w:r>
+            <w:proofErr w:type="spellEnd"/>
+            <w:r>
+              <w:rPr>
+                <w:color w:val="374151"/>
+                <w:sz w:val="20"/>
+              </w:rPr>
+              <w:t xml:space="preserve"> Live Announcement Testing</w:t>
             </w:r>
           </w:p>
         </w:tc>
@@ -1409,6 +1885,7 @@
       <w:tr>
         <w:tc>
           <w:tcPr>
+            <w:tcW w:w="0" w:type="auto"/>
             <w:shd w:val="clear" w:color="auto" w:fill="FFFFFF"/>
           </w:tcPr>
           <w:p>
@@ -1426,6 +1903,7 @@
         </w:tc>
         <w:tc>
           <w:tcPr>
+            <w:tcW w:w="0" w:type="auto"/>
             <w:shd w:val="clear" w:color="auto" w:fill="FFFFFF"/>
           </w:tcPr>
           <w:p>
@@ -1443,6 +1921,7 @@
         </w:tc>
         <w:tc>
           <w:tcPr>
+            <w:tcW w:w="0" w:type="auto"/>
             <w:shd w:val="clear" w:color="auto" w:fill="FFFFFF"/>
           </w:tcPr>
           <w:p>
@@ -1460,6 +1939,7 @@
         </w:tc>
         <w:tc>
           <w:tcPr>
+            <w:tcW w:w="0" w:type="auto"/>
             <w:shd w:val="clear" w:color="auto" w:fill="FFFFFF"/>
           </w:tcPr>
           <w:p>
@@ -1471,7 +1951,23 @@
                 <w:color w:val="374151"/>
                 <w:sz w:val="20"/>
               </w:rPr>
-              <w:t>Chrome DevTools Performance &amp; Frame Rate Profiler</w:t>
+              <w:t xml:space="preserve">Chrome </w:t>
+            </w:r>
+            <w:proofErr w:type="spellStart"/>
+            <w:r>
+              <w:rPr>
+                <w:color w:val="374151"/>
+                <w:sz w:val="20"/>
+              </w:rPr>
+              <w:t>DevTools</w:t>
+            </w:r>
+            <w:proofErr w:type="spellEnd"/>
+            <w:r>
+              <w:rPr>
+                <w:color w:val="374151"/>
+                <w:sz w:val="20"/>
+              </w:rPr>
+              <w:t xml:space="preserve"> Performance &amp; Frame Rate Profiler</w:t>
             </w:r>
           </w:p>
         </w:tc>
@@ -1479,6 +1975,7 @@
       <w:tr>
         <w:tc>
           <w:tcPr>
+            <w:tcW w:w="0" w:type="auto"/>
             <w:shd w:val="clear" w:color="auto" w:fill="F9FAFB"/>
           </w:tcPr>
           <w:p>
@@ -1496,6 +1993,7 @@
         </w:tc>
         <w:tc>
           <w:tcPr>
+            <w:tcW w:w="0" w:type="auto"/>
             <w:shd w:val="clear" w:color="auto" w:fill="F9FAFB"/>
           </w:tcPr>
           <w:p>
@@ -1513,6 +2011,7 @@
         </w:tc>
         <w:tc>
           <w:tcPr>
+            <w:tcW w:w="0" w:type="auto"/>
             <w:shd w:val="clear" w:color="auto" w:fill="F9FAFB"/>
           </w:tcPr>
           <w:p>
@@ -1530,6 +2029,7 @@
         </w:tc>
         <w:tc>
           <w:tcPr>
+            <w:tcW w:w="0" w:type="auto"/>
             <w:shd w:val="clear" w:color="auto" w:fill="F9FAFB"/>
           </w:tcPr>
           <w:p>
@@ -1547,35 +2047,27 @@
         </w:tc>
       </w:tr>
     </w:tbl>
+    <w:p/>
     <w:p>
       <w:pPr>
-        <w:spacing w:after="160"/>
-      </w:pPr>
+        <w:spacing w:before="280" w:after="120"/>
+      </w:pPr>
+      <w:r>
+        <w:rPr>
+          <w:b/>
+          <w:color w:val="1E3A8A"/>
+          <w:sz w:val="32"/>
+        </w:rPr>
+        <w:t>7. Conclusion &amp; Evaluation Readiness</w:t>
+      </w:r>
     </w:p>
     <w:p>
       <w:pPr>
-        <w:pStyle w:val="Heading1"/>
-        <w:spacing w:before="280" w:after="120"/>
-      </w:pPr>
-      <w:r>
-        <w:rPr>
-          <w:rFonts w:ascii="Calibri" w:hAnsi="Calibri"/>
-          <w:b/>
-          <w:color w:val="1E3A8A"/>
-          <w:sz w:val="32"/>
-        </w:rPr>
-        <w:t>7. Conclusion &amp; Evaluation Readiness</w:t>
-      </w:r>
-    </w:p>
-    <w:p>
-      <w:pPr>
         <w:spacing w:after="120" w:line="276" w:lineRule="auto"/>
       </w:pPr>
       <w:r>
         <w:rPr>
-          <w:rFonts w:ascii="Calibri" w:hAnsi="Calibri"/>
           <w:color w:val="374151"/>
-          <w:sz w:val="22"/>
         </w:rPr>
         <w:t>The Week 2 Interactive Web Components Suite fully meets and surpasses all requirements defined in the Yuva Intern syllabus. All components are packaged with clear documentation, rigorous keyboard handling, and an interactive showcase playground ready for evaluation.</w:t>
       </w:r>
@@ -1583,22 +2075,732 @@
     <w:sectPr>
       <w:pgSz w:w="12240" w:h="15840"/>
       <w:pgMar w:top="1440" w:right="1440" w:bottom="1440" w:left="1440" w:header="720" w:footer="720" w:gutter="0"/>
+      <w:cols w:space="720"/>
     </w:sectPr>
   </w:body>
 </w:document>
 </file>
 
 <file path=word/styles.xml><?xml version="1.0" encoding="utf-8"?>
-<w:styles xmlns:w="http://schemas.openxmlformats.org/wordprocessingml/2006/main">
+<w:styles xmlns:mc="http://schemas.openxmlformats.org/markup-compatibility/2006" xmlns:r="http://schemas.openxmlformats.org/officeDocument/2006/relationships" xmlns:w="http://schemas.openxmlformats.org/wordprocessingml/2006/main" xmlns:w14="http://schemas.microsoft.com/office/word/2010/wordml" xmlns:w15="http://schemas.microsoft.com/office/word/2012/wordml" xmlns:w16cex="http://schemas.microsoft.com/office/word/2018/wordml/cex" xmlns:w16cid="http://schemas.microsoft.com/office/word/2016/wordml/cid" xmlns:w16="http://schemas.microsoft.com/office/word/2018/wordml" xmlns:w16du="http://schemas.microsoft.com/office/word/2023/wordml/word16du" xmlns:w16sdtdh="http://schemas.microsoft.com/office/word/2020/wordml/sdtdatahash" xmlns:w16sdtfl="http://schemas.microsoft.com/office/word/2024/wordml/sdtformatlock" xmlns:w16se="http://schemas.microsoft.com/office/word/2015/wordml/symex" mc:Ignorable="w14 w15 w16se w16cid w16 w16cex w16sdtdh w16sdtfl w16du">
   <w:docDefaults>
     <w:rPrDefault>
       <w:rPr>
-        <w:rFonts w:ascii="Calibri" w:hAnsi="Calibri" w:cs="Calibri"/>
+        <w:rFonts w:ascii="Calibri" w:eastAsia="Times New Roman" w:hAnsi="Calibri" w:cs="Calibri"/>
         <w:sz w:val="22"/>
         <w:szCs w:val="22"/>
-        <w:lang w:val="en-US"/>
+        <w:lang w:val="en-US" w:eastAsia="en-US" w:bidi="hi-IN"/>
       </w:rPr>
     </w:rPrDefault>
+    <w:pPrDefault>
+      <w:pPr>
+        <w:spacing w:after="160" w:line="278" w:lineRule="auto"/>
+      </w:pPr>
+    </w:pPrDefault>
   </w:docDefaults>
+  <w:latentStyles w:defLockedState="0" w:defUIPriority="99" w:defSemiHidden="0" w:defUnhideWhenUsed="0" w:defQFormat="0" w:count="376">
+    <w:lsdException w:name="Normal" w:uiPriority="0" w:qFormat="1"/>
+    <w:lsdException w:name="heading 1" w:uiPriority="9" w:qFormat="1"/>
+    <w:lsdException w:name="heading 2" w:semiHidden="1" w:uiPriority="9" w:unhideWhenUsed="1" w:qFormat="1"/>
+    <w:lsdException w:name="heading 3" w:semiHidden="1" w:uiPriority="9" w:unhideWhenUsed="1" w:qFormat="1"/>
+    <w:lsdException w:name="heading 4" w:semiHidden="1" w:uiPriority="9" w:unhideWhenUsed="1" w:qFormat="1"/>
+    <w:lsdException w:name="heading 5" w:semiHidden="1" w:uiPriority="9" w:unhideWhenUsed="1" w:qFormat="1"/>
+    <w:lsdException w:name="heading 6" w:semiHidden="1" w:uiPriority="9" w:unhideWhenUsed="1" w:qFormat="1"/>
+    <w:lsdException w:name="heading 7" w:semiHidden="1" w:uiPriority="9" w:unhideWhenUsed="1" w:qFormat="1"/>
+    <w:lsdException w:name="heading 8" w:semiHidden="1" w:uiPriority="9" w:unhideWhenUsed="1" w:qFormat="1"/>
+    <w:lsdException w:name="heading 9" w:semiHidden="1" w:uiPriority="9" w:unhideWhenUsed="1" w:qFormat="1"/>
+    <w:lsdException w:name="index 1" w:semiHidden="1" w:unhideWhenUsed="1"/>
+    <w:lsdException w:name="index 2" w:semiHidden="1" w:unhideWhenUsed="1"/>
+    <w:lsdException w:name="index 3" w:semiHidden="1" w:unhideWhenUsed="1"/>
+    <w:lsdException w:name="index 4" w:semiHidden="1" w:unhideWhenUsed="1"/>
+    <w:lsdException w:name="index 5" w:semiHidden="1" w:unhideWhenUsed="1"/>
+    <w:lsdException w:name="index 6" w:semiHidden="1" w:unhideWhenUsed="1"/>
+    <w:lsdException w:name="index 7" w:semiHidden="1" w:unhideWhenUsed="1"/>
+    <w:lsdException w:name="index 8" w:semiHidden="1" w:unhideWhenUsed="1"/>
+    <w:lsdException w:name="index 9" w:semiHidden="1" w:unhideWhenUsed="1"/>
+    <w:lsdException w:name="toc 1" w:semiHidden="1" w:uiPriority="39" w:unhideWhenUsed="1"/>
+    <w:lsdException w:name="toc 2" w:semiHidden="1" w:uiPriority="39" w:unhideWhenUsed="1"/>
+    <w:lsdException w:name="toc 3" w:semiHidden="1" w:uiPriority="39" w:unhideWhenUsed="1"/>
+    <w:lsdException w:name="toc 4" w:semiHidden="1" w:uiPriority="39" w:unhideWhenUsed="1"/>
+    <w:lsdException w:name="toc 5" w:semiHidden="1" w:uiPriority="39" w:unhideWhenUsed="1"/>
+    <w:lsdException w:name="toc 6" w:semiHidden="1" w:uiPriority="39" w:unhideWhenUsed="1"/>
+    <w:lsdException w:name="toc 7" w:semiHidden="1" w:uiPriority="39" w:unhideWhenUsed="1"/>
+    <w:lsdException w:name="toc 8" w:semiHidden="1" w:uiPriority="39" w:unhideWhenUsed="1"/>
+    <w:lsdException w:name="toc 9" w:semiHidden="1" w:uiPriority="39" w:unhideWhenUsed="1"/>
+    <w:lsdException w:name="Normal Indent" w:semiHidden="1" w:unhideWhenUsed="1"/>
+    <w:lsdException w:name="footnote text" w:semiHidden="1" w:unhideWhenUsed="1"/>
+    <w:lsdException w:name="annotation text" w:semiHidden="1" w:unhideWhenUsed="1"/>
+    <w:lsdException w:name="header" w:semiHidden="1" w:unhideWhenUsed="1"/>
+    <w:lsdException w:name="footer" w:semiHidden="1" w:unhideWhenUsed="1"/>
+    <w:lsdException w:name="index heading" w:semiHidden="1" w:unhideWhenUsed="1"/>
+    <w:lsdException w:name="caption" w:semiHidden="1" w:uiPriority="35" w:unhideWhenUsed="1" w:qFormat="1"/>
+    <w:lsdException w:name="table of figures" w:semiHidden="1" w:unhideWhenUsed="1"/>
+    <w:lsdException w:name="envelope address" w:semiHidden="1" w:unhideWhenUsed="1"/>
+    <w:lsdException w:name="envelope return" w:semiHidden="1" w:unhideWhenUsed="1"/>
+    <w:lsdException w:name="footnote reference" w:semiHidden="1" w:unhideWhenUsed="1"/>
+    <w:lsdException w:name="annotation reference" w:semiHidden="1" w:unhideWhenUsed="1"/>
+    <w:lsdException w:name="line number" w:semiHidden="1" w:unhideWhenUsed="1"/>
+    <w:lsdException w:name="page number" w:semiHidden="1" w:unhideWhenUsed="1"/>
+    <w:lsdException w:name="endnote reference" w:semiHidden="1" w:unhideWhenUsed="1"/>
+    <w:lsdException w:name="endnote text" w:semiHidden="1" w:unhideWhenUsed="1"/>
+    <w:lsdException w:name="table of authorities" w:semiHidden="1" w:unhideWhenUsed="1"/>
+    <w:lsdException w:name="macro" w:semiHidden="1" w:unhideWhenUsed="1"/>
+    <w:lsdException w:name="toa heading" w:semiHidden="1" w:unhideWhenUsed="1"/>
+    <w:lsdException w:name="List" w:semiHidden="1" w:unhideWhenUsed="1"/>
+    <w:lsdException w:name="List Bullet" w:semiHidden="1" w:unhideWhenUsed="1"/>
+    <w:lsdException w:name="List Number" w:semiHidden="1" w:unhideWhenUsed="1"/>
+    <w:lsdException w:name="List 2" w:semiHidden="1" w:unhideWhenUsed="1"/>
+    <w:lsdException w:name="List 3" w:semiHidden="1" w:unhideWhenUsed="1"/>
+    <w:lsdException w:name="List 4" w:semiHidden="1" w:unhideWhenUsed="1"/>
+    <w:lsdException w:name="List 5" w:semiHidden="1" w:unhideWhenUsed="1"/>
+    <w:lsdException w:name="List Bullet 2" w:semiHidden="1" w:unhideWhenUsed="1"/>
+    <w:lsdException w:name="List Bullet 3" w:semiHidden="1" w:unhideWhenUsed="1"/>
+    <w:lsdException w:name="List Bullet 4" w:semiHidden="1" w:unhideWhenUsed="1"/>
+    <w:lsdException w:name="List Bullet 5" w:semiHidden="1" w:unhideWhenUsed="1"/>
+    <w:lsdException w:name="List Number 2" w:semiHidden="1" w:unhideWhenUsed="1"/>
+    <w:lsdException w:name="List Number 3" w:semiHidden="1" w:unhideWhenUsed="1"/>
+    <w:lsdException w:name="List Number 4" w:semiHidden="1" w:unhideWhenUsed="1"/>
+    <w:lsdException w:name="List Number 5" w:semiHidden="1" w:unhideWhenUsed="1"/>
+    <w:lsdException w:name="Title" w:uiPriority="10" w:qFormat="1"/>
+    <w:lsdException w:name="Closing" w:semiHidden="1" w:unhideWhenUsed="1"/>
+    <w:lsdException w:name="Signature" w:semiHidden="1" w:unhideWhenUsed="1"/>
+    <w:lsdException w:name="Default Paragraph Font" w:semiHidden="1" w:uiPriority="1" w:unhideWhenUsed="1"/>
+    <w:lsdException w:name="Body Text" w:semiHidden="1" w:unhideWhenUsed="1"/>
+    <w:lsdException w:name="Body Text Indent" w:semiHidden="1" w:unhideWhenUsed="1"/>
+    <w:lsdException w:name="List Continue" w:semiHidden="1" w:unhideWhenUsed="1"/>
+    <w:lsdException w:name="List Continue 2" w:semiHidden="1" w:unhideWhenUsed="1"/>
+    <w:lsdException w:name="List Continue 3" w:semiHidden="1" w:unhideWhenUsed="1"/>
+    <w:lsdException w:name="List Continue 4" w:semiHidden="1" w:unhideWhenUsed="1"/>
+    <w:lsdException w:name="List Continue 5" w:semiHidden="1" w:unhideWhenUsed="1"/>
+    <w:lsdException w:name="Message Header" w:semiHidden="1" w:unhideWhenUsed="1"/>
+    <w:lsdException w:name="Subtitle" w:uiPriority="11" w:qFormat="1"/>
+    <w:lsdException w:name="Salutation" w:semiHidden="1" w:unhideWhenUsed="1"/>
+    <w:lsdException w:name="Date" w:semiHidden="1" w:unhideWhenUsed="1"/>
+    <w:lsdException w:name="Body Text First Indent" w:semiHidden="1" w:unhideWhenUsed="1"/>
+    <w:lsdException w:name="Body Text First Indent 2" w:semiHidden="1" w:unhideWhenUsed="1"/>
+    <w:lsdException w:name="Note Heading" w:semiHidden="1" w:unhideWhenUsed="1"/>
+    <w:lsdException w:name="Body Text 2" w:semiHidden="1" w:unhideWhenUsed="1"/>
+    <w:lsdException w:name="Body Text 3" w:semiHidden="1" w:unhideWhenUsed="1"/>
+    <w:lsdException w:name="Body Text Indent 2" w:semiHidden="1" w:unhideWhenUsed="1"/>
+    <w:lsdException w:name="Body Text Indent 3" w:semiHidden="1" w:unhideWhenUsed="1"/>
+    <w:lsdException w:name="Block Text" w:semiHidden="1" w:unhideWhenUsed="1"/>
+    <w:lsdException w:name="Hyperlink" w:semiHidden="1" w:unhideWhenUsed="1"/>
+    <w:lsdException w:name="FollowedHyperlink" w:semiHidden="1" w:unhideWhenUsed="1"/>
+    <w:lsdException w:name="Strong" w:uiPriority="22" w:qFormat="1"/>
+    <w:lsdException w:name="Emphasis" w:uiPriority="20" w:qFormat="1"/>
+    <w:lsdException w:name="Document Map" w:semiHidden="1" w:unhideWhenUsed="1"/>
+    <w:lsdException w:name="Plain Text" w:semiHidden="1" w:unhideWhenUsed="1"/>
+    <w:lsdException w:name="E-mail Signature" w:semiHidden="1" w:unhideWhenUsed="1"/>
+    <w:lsdException w:name="HTML Top of Form" w:semiHidden="1" w:unhideWhenUsed="1"/>
+    <w:lsdException w:name="HTML Bottom of Form" w:semiHidden="1" w:unhideWhenUsed="1"/>
+    <w:lsdException w:name="Normal (Web)" w:semiHidden="1" w:unhideWhenUsed="1"/>
+    <w:lsdException w:name="HTML Acronym" w:semiHidden="1" w:unhideWhenUsed="1"/>
+    <w:lsdException w:name="HTML Address" w:semiHidden="1" w:unhideWhenUsed="1"/>
+    <w:lsdException w:name="HTML Cite" w:semiHidden="1" w:unhideWhenUsed="1"/>
+    <w:lsdException w:name="HTML Code" w:semiHidden="1" w:unhideWhenUsed="1"/>
+    <w:lsdException w:name="HTML Definition" w:semiHidden="1" w:unhideWhenUsed="1"/>
+    <w:lsdException w:name="HTML Keyboard" w:semiHidden="1" w:unhideWhenUsed="1"/>
+    <w:lsdException w:name="HTML Preformatted" w:semiHidden="1" w:unhideWhenUsed="1"/>
+    <w:lsdException w:name="HTML Sample" w:semiHidden="1" w:unhideWhenUsed="1"/>
+    <w:lsdException w:name="HTML Typewriter" w:semiHidden="1" w:unhideWhenUsed="1"/>
+    <w:lsdException w:name="HTML Variable" w:semiHidden="1" w:unhideWhenUsed="1"/>
+    <w:lsdException w:name="Normal Table" w:semiHidden="1" w:unhideWhenUsed="1"/>
+    <w:lsdException w:name="annotation subject" w:semiHidden="1" w:unhideWhenUsed="1"/>
+    <w:lsdException w:name="No List" w:semiHidden="1" w:unhideWhenUsed="1"/>
+    <w:lsdException w:name="Outline List 1" w:semiHidden="1" w:unhideWhenUsed="1"/>
+    <w:lsdException w:name="Outline List 2" w:semiHidden="1" w:unhideWhenUsed="1"/>
+    <w:lsdException w:name="Outline List 3" w:semiHidden="1" w:unhideWhenUsed="1"/>
+    <w:lsdException w:name="Table Simple 1" w:semiHidden="1" w:unhideWhenUsed="1"/>
+    <w:lsdException w:name="Table Simple 2" w:semiHidden="1" w:unhideWhenUsed="1"/>
+    <w:lsdException w:name="Table Simple 3" w:semiHidden="1" w:unhideWhenUsed="1"/>
+    <w:lsdException w:name="Table Classic 1" w:semiHidden="1" w:unhideWhenUsed="1"/>
+    <w:lsdException w:name="Table Classic 2" w:semiHidden="1" w:unhideWhenUsed="1"/>
+    <w:lsdException w:name="Table Classic 3" w:semiHidden="1" w:unhideWhenUsed="1"/>
+    <w:lsdException w:name="Table Classic 4" w:semiHidden="1" w:unhideWhenUsed="1"/>
+    <w:lsdException w:name="Table Colorful 1" w:semiHidden="1" w:unhideWhenUsed="1"/>
+    <w:lsdException w:name="Table Colorful 2" w:semiHidden="1" w:unhideWhenUsed="1"/>
+    <w:lsdException w:name="Table Colorful 3" w:semiHidden="1" w:unhideWhenUsed="1"/>
+    <w:lsdException w:name="Table Columns 1" w:semiHidden="1" w:unhideWhenUsed="1"/>
+    <w:lsdException w:name="Table Columns 2" w:semiHidden="1" w:unhideWhenUsed="1"/>
+    <w:lsdException w:name="Table Columns 3" w:semiHidden="1" w:unhideWhenUsed="1"/>
+    <w:lsdException w:name="Table Columns 4" w:semiHidden="1" w:unhideWhenUsed="1"/>
+    <w:lsdException w:name="Table Columns 5" w:semiHidden="1" w:unhideWhenUsed="1"/>
+    <w:lsdException w:name="Table Grid 1" w:semiHidden="1" w:unhideWhenUsed="1"/>
+    <w:lsdException w:name="Table Grid 2" w:semiHidden="1" w:unhideWhenUsed="1"/>
+    <w:lsdException w:name="Table Grid 3" w:semiHidden="1" w:unhideWhenUsed="1"/>
+    <w:lsdException w:name="Table Grid 4" w:semiHidden="1" w:unhideWhenUsed="1"/>
+    <w:lsdException w:name="Table Grid 5" w:semiHidden="1" w:unhideWhenUsed="1"/>
+    <w:lsdException w:name="Table Grid 6" w:semiHidden="1" w:unhideWhenUsed="1"/>
+    <w:lsdException w:name="Table Grid 7" w:semiHidden="1" w:unhideWhenUsed="1"/>
+    <w:lsdException w:name="Table Grid 8" w:semiHidden="1" w:unhideWhenUsed="1"/>
+    <w:lsdException w:name="Table List 1" w:semiHidden="1" w:unhideWhenUsed="1"/>
+    <w:lsdException w:name="Table List 2" w:semiHidden="1" w:unhideWhenUsed="1"/>
+    <w:lsdException w:name="Table List 3" w:semiHidden="1" w:unhideWhenUsed="1"/>
+    <w:lsdException w:name="Table List 4" w:semiHidden="1" w:unhideWhenUsed="1"/>
+    <w:lsdException w:name="Table List 5" w:semiHidden="1" w:unhideWhenUsed="1"/>
+    <w:lsdException w:name="Table List 6" w:semiHidden="1" w:unhideWhenUsed="1"/>
+    <w:lsdException w:name="Table List 7" w:semiHidden="1" w:unhideWhenUsed="1"/>
+    <w:lsdException w:name="Table List 8" w:semiHidden="1" w:unhideWhenUsed="1"/>
+    <w:lsdException w:name="Table 3D effects 1" w:semiHidden="1" w:unhideWhenUsed="1"/>
+    <w:lsdException w:name="Table 3D effects 2" w:semiHidden="1" w:unhideWhenUsed="1"/>
+    <w:lsdException w:name="Table 3D effects 3" w:semiHidden="1" w:unhideWhenUsed="1"/>
+    <w:lsdException w:name="Table Contemporary" w:semiHidden="1" w:unhideWhenUsed="1"/>
+    <w:lsdException w:name="Table Elegant" w:semiHidden="1" w:unhideWhenUsed="1"/>
+    <w:lsdException w:name="Table Professional" w:semiHidden="1" w:unhideWhenUsed="1"/>
+    <w:lsdException w:name="Table Subtle 1" w:semiHidden="1" w:unhideWhenUsed="1"/>
+    <w:lsdException w:name="Table Subtle 2" w:semiHidden="1" w:unhideWhenUsed="1"/>
+    <w:lsdException w:name="Table Web 1" w:semiHidden="1" w:unhideWhenUsed="1"/>
+    <w:lsdException w:name="Table Web 2" w:semiHidden="1" w:unhideWhenUsed="1"/>
+    <w:lsdException w:name="Table Web 3" w:semiHidden="1" w:unhideWhenUsed="1"/>
+    <w:lsdException w:name="Balloon Text" w:semiHidden="1" w:unhideWhenUsed="1"/>
+    <w:lsdException w:name="Table Grid" w:uiPriority="39"/>
+    <w:lsdException w:name="Table Theme" w:semiHidden="1" w:unhideWhenUsed="1"/>
+    <w:lsdException w:name="Placeholder Text" w:semiHidden="1"/>
+    <w:lsdException w:name="No Spacing" w:uiPriority="1" w:qFormat="1"/>
+    <w:lsdException w:name="Light Shading" w:uiPriority="60"/>
+    <w:lsdException w:name="Light List" w:uiPriority="61"/>
+    <w:lsdException w:name="Light Grid" w:uiPriority="62"/>
+    <w:lsdException w:name="Medium Shading 1" w:uiPriority="63"/>
+    <w:lsdException w:name="Medium Shading 2" w:uiPriority="64"/>
+    <w:lsdException w:name="Medium List 1" w:uiPriority="65"/>
+    <w:lsdException w:name="Medium List 2" w:uiPriority="66"/>
+    <w:lsdException w:name="Medium Grid 1" w:uiPriority="67"/>
+    <w:lsdException w:name="Medium Grid 2" w:uiPriority="68"/>
+    <w:lsdException w:name="Medium Grid 3" w:uiPriority="69"/>
+    <w:lsdException w:name="Dark List" w:uiPriority="70"/>
+    <w:lsdException w:name="Colorful Shading" w:uiPriority="71"/>
+    <w:lsdException w:name="Colorful List" w:uiPriority="72"/>
+    <w:lsdException w:name="Colorful Grid" w:uiPriority="73"/>
+    <w:lsdException w:name="Light Shading Accent 1" w:uiPriority="60"/>
+    <w:lsdException w:name="Light List Accent 1" w:uiPriority="61"/>
+    <w:lsdException w:name="Light Grid Accent 1" w:uiPriority="62"/>
+    <w:lsdException w:name="Medium Shading 1 Accent 1" w:uiPriority="63"/>
+    <w:lsdException w:name="Medium Shading 2 Accent 1" w:uiPriority="64"/>
+    <w:lsdException w:name="Medium List 1 Accent 1" w:uiPriority="65"/>
+    <w:lsdException w:name="Revision" w:semiHidden="1"/>
+    <w:lsdException w:name="List Paragraph" w:uiPriority="34" w:qFormat="1"/>
+    <w:lsdException w:name="Quote" w:uiPriority="29" w:qFormat="1"/>
+    <w:lsdException w:name="Intense Quote" w:uiPriority="30" w:qFormat="1"/>
+    <w:lsdException w:name="Medium List 2 Accent 1" w:uiPriority="66"/>
+    <w:lsdException w:name="Medium Grid 1 Accent 1" w:uiPriority="67"/>
+    <w:lsdException w:name="Medium Grid 2 Accent 1" w:uiPriority="68"/>
+    <w:lsdException w:name="Medium Grid 3 Accent 1" w:uiPriority="69"/>
+    <w:lsdException w:name="Dark List Accent 1" w:uiPriority="70"/>
+    <w:lsdException w:name="Colorful Shading Accent 1" w:uiPriority="71"/>
+    <w:lsdException w:name="Colorful List Accent 1" w:uiPriority="72"/>
+    <w:lsdException w:name="Colorful Grid Accent 1" w:uiPriority="73"/>
+    <w:lsdException w:name="Light Shading Accent 2" w:uiPriority="60"/>
+    <w:lsdException w:name="Light List Accent 2" w:uiPriority="61"/>
+    <w:lsdException w:name="Light Grid Accent 2" w:uiPriority="62"/>
+    <w:lsdException w:name="Medium Shading 1 Accent 2" w:uiPriority="63"/>
+    <w:lsdException w:name="Medium Shading 2 Accent 2" w:uiPriority="64"/>
+    <w:lsdException w:name="Medium List 1 Accent 2" w:uiPriority="65"/>
+    <w:lsdException w:name="Medium List 2 Accent 2" w:uiPriority="66"/>
+    <w:lsdException w:name="Medium Grid 1 Accent 2" w:uiPriority="67"/>
+    <w:lsdException w:name="Medium Grid 2 Accent 2" w:uiPriority="68"/>
+    <w:lsdException w:name="Medium Grid 3 Accent 2" w:uiPriority="69"/>
+    <w:lsdException w:name="Dark List Accent 2" w:uiPriority="70"/>
+    <w:lsdException w:name="Colorful Shading Accent 2" w:uiPriority="71"/>
+    <w:lsdException w:name="Colorful List Accent 2" w:uiPriority="72"/>
+    <w:lsdException w:name="Colorful Grid Accent 2" w:uiPriority="73"/>
+    <w:lsdException w:name="Light Shading Accent 3" w:uiPriority="60"/>
+    <w:lsdException w:name="Light List Accent 3" w:uiPriority="61"/>
+    <w:lsdException w:name="Light Grid Accent 3" w:uiPriority="62"/>
+    <w:lsdException w:name="Medium Shading 1 Accent 3" w:uiPriority="63"/>
+    <w:lsdException w:name="Medium Shading 2 Accent 3" w:uiPriority="64"/>
+    <w:lsdException w:name="Medium List 1 Accent 3" w:uiPriority="65"/>
+    <w:lsdException w:name="Medium List 2 Accent 3" w:uiPriority="66"/>
+    <w:lsdException w:name="Medium Grid 1 Accent 3" w:uiPriority="67"/>
+    <w:lsdException w:name="Medium Grid 2 Accent 3" w:uiPriority="68"/>
+    <w:lsdException w:name="Medium Grid 3 Accent 3" w:uiPriority="69"/>
+    <w:lsdException w:name="Dark List Accent 3" w:uiPriority="70"/>
+    <w:lsdException w:name="Colorful Shading Accent 3" w:uiPriority="71"/>
+    <w:lsdException w:name="Colorful List Accent 3" w:uiPriority="72"/>
+    <w:lsdException w:name="Colorful Grid Accent 3" w:uiPriority="73"/>
+    <w:lsdException w:name="Light Shading Accent 4" w:uiPriority="60"/>
+    <w:lsdException w:name="Light List Accent 4" w:uiPriority="61"/>
+    <w:lsdException w:name="Light Grid Accent 4" w:uiPriority="62"/>
+    <w:lsdException w:name="Medium Shading 1 Accent 4" w:uiPriority="63"/>
+    <w:lsdException w:name="Medium Shading 2 Accent 4" w:uiPriority="64"/>
+    <w:lsdException w:name="Medium List 1 Accent 4" w:uiPriority="65"/>
+    <w:lsdException w:name="Medium List 2 Accent 4" w:uiPriority="66"/>
+    <w:lsdException w:name="Medium Grid 1 Accent 4" w:uiPriority="67"/>
+    <w:lsdException w:name="Medium Grid 2 Accent 4" w:uiPriority="68"/>
+    <w:lsdException w:name="Medium Grid 3 Accent 4" w:uiPriority="69"/>
+    <w:lsdException w:name="Dark List Accent 4" w:uiPriority="70"/>
+    <w:lsdException w:name="Colorful Shading Accent 4" w:uiPriority="71"/>
+    <w:lsdException w:name="Colorful List Accent 4" w:uiPriority="72"/>
+    <w:lsdException w:name="Colorful Grid Accent 4" w:uiPriority="73"/>
+    <w:lsdException w:name="Light Shading Accent 5" w:uiPriority="60"/>
+    <w:lsdException w:name="Light List Accent 5" w:uiPriority="61"/>
+    <w:lsdException w:name="Light Grid Accent 5" w:uiPriority="62"/>
+    <w:lsdException w:name="Medium Shading 1 Accent 5" w:uiPriority="63"/>
+    <w:lsdException w:name="Medium Shading 2 Accent 5" w:uiPriority="64"/>
+    <w:lsdException w:name="Medium List 1 Accent 5" w:uiPriority="65"/>
+    <w:lsdException w:name="Medium List 2 Accent 5" w:uiPriority="66"/>
+    <w:lsdException w:name="Medium Grid 1 Accent 5" w:uiPriority="67"/>
+    <w:lsdException w:name="Medium Grid 2 Accent 5" w:uiPriority="68"/>
+    <w:lsdException w:name="Medium Grid 3 Accent 5" w:uiPriority="69"/>
+    <w:lsdException w:name="Dark List Accent 5" w:uiPriority="70"/>
+    <w:lsdException w:name="Colorful Shading Accent 5" w:uiPriority="71"/>
+    <w:lsdException w:name="Colorful List Accent 5" w:uiPriority="72"/>
+    <w:lsdException w:name="Colorful Grid Accent 5" w:uiPriority="73"/>
+    <w:lsdException w:name="Light Shading Accent 6" w:uiPriority="60"/>
+    <w:lsdException w:name="Light List Accent 6" w:uiPriority="61"/>
+    <w:lsdException w:name="Light Grid Accent 6" w:uiPriority="62"/>
+    <w:lsdException w:name="Medium Shading 1 Accent 6" w:uiPriority="63"/>
+    <w:lsdException w:name="Medium Shading 2 Accent 6" w:uiPriority="64"/>
+    <w:lsdException w:name="Medium List 1 Accent 6" w:uiPriority="65"/>
+    <w:lsdException w:name="Medium List 2 Accent 6" w:uiPriority="66"/>
+    <w:lsdException w:name="Medium Grid 1 Accent 6" w:uiPriority="67"/>
+    <w:lsdException w:name="Medium Grid 2 Accent 6" w:uiPriority="68"/>
+    <w:lsdException w:name="Medium Grid 3 Accent 6" w:uiPriority="69"/>
+    <w:lsdException w:name="Dark List Accent 6" w:uiPriority="70"/>
+    <w:lsdException w:name="Colorful Shading Accent 6" w:uiPriority="71"/>
+    <w:lsdException w:name="Colorful List Accent 6" w:uiPriority="72"/>
+    <w:lsdException w:name="Colorful Grid Accent 6" w:uiPriority="73"/>
+    <w:lsdException w:name="Subtle Emphasis" w:uiPriority="19" w:qFormat="1"/>
+    <w:lsdException w:name="Intense Emphasis" w:uiPriority="21" w:qFormat="1"/>
+    <w:lsdException w:name="Subtle Reference" w:uiPriority="31" w:qFormat="1"/>
+    <w:lsdException w:name="Intense Reference" w:uiPriority="32" w:qFormat="1"/>
+    <w:lsdException w:name="Book Title" w:uiPriority="33" w:qFormat="1"/>
+    <w:lsdException w:name="Bibliography" w:semiHidden="1" w:uiPriority="37" w:unhideWhenUsed="1"/>
+    <w:lsdException w:name="TOC Heading" w:semiHidden="1" w:uiPriority="39" w:unhideWhenUsed="1" w:qFormat="1"/>
+    <w:lsdException w:name="Plain Table 1" w:uiPriority="41"/>
+    <w:lsdException w:name="Plain Table 2" w:uiPriority="42"/>
+    <w:lsdException w:name="Plain Table 3" w:uiPriority="43"/>
+    <w:lsdException w:name="Plain Table 4" w:uiPriority="44"/>
+    <w:lsdException w:name="Plain Table 5" w:uiPriority="45"/>
+    <w:lsdException w:name="Grid Table Light" w:uiPriority="40"/>
+    <w:lsdException w:name="Grid Table 1 Light" w:uiPriority="46"/>
+    <w:lsdException w:name="Grid Table 2" w:uiPriority="47"/>
+    <w:lsdException w:name="Grid Table 3" w:uiPriority="48"/>
+    <w:lsdException w:name="Grid Table 4" w:uiPriority="49"/>
+    <w:lsdException w:name="Grid Table 5 Dark" w:uiPriority="50"/>
+    <w:lsdException w:name="Grid Table 6 Colorful" w:uiPriority="51"/>
+    <w:lsdException w:name="Grid Table 7 Colorful" w:uiPriority="52"/>
+    <w:lsdException w:name="Grid Table 1 Light Accent 1" w:uiPriority="46"/>
+    <w:lsdException w:name="Grid Table 2 Accent 1" w:uiPriority="47"/>
+    <w:lsdException w:name="Grid Table 3 Accent 1" w:uiPriority="48"/>
+    <w:lsdException w:name="Grid Table 4 Accent 1" w:uiPriority="49"/>
+    <w:lsdException w:name="Grid Table 5 Dark Accent 1" w:uiPriority="50"/>
+    <w:lsdException w:name="Grid Table 6 Colorful Accent 1" w:uiPriority="51"/>
+    <w:lsdException w:name="Grid Table 7 Colorful Accent 1" w:uiPriority="52"/>
+    <w:lsdException w:name="Grid Table 1 Light Accent 2" w:uiPriority="46"/>
+    <w:lsdException w:name="Grid Table 2 Accent 2" w:uiPriority="47"/>
+    <w:lsdException w:name="Grid Table 3 Accent 2" w:uiPriority="48"/>
+    <w:lsdException w:name="Grid Table 4 Accent 2" w:uiPriority="49"/>
+    <w:lsdException w:name="Grid Table 5 Dark Accent 2" w:uiPriority="50"/>
+    <w:lsdException w:name="Grid Table 6 Colorful Accent 2" w:uiPriority="51"/>
+    <w:lsdException w:name="Grid Table 7 Colorful Accent 2" w:uiPriority="52"/>
+    <w:lsdException w:name="Grid Table 1 Light Accent 3" w:uiPriority="46"/>
+    <w:lsdException w:name="Grid Table 2 Accent 3" w:uiPriority="47"/>
+    <w:lsdException w:name="Grid Table 3 Accent 3" w:uiPriority="48"/>
+    <w:lsdException w:name="Grid Table 4 Accent 3" w:uiPriority="49"/>
+    <w:lsdException w:name="Grid Table 5 Dark Accent 3" w:uiPriority="50"/>
+    <w:lsdException w:name="Grid Table 6 Colorful Accent 3" w:uiPriority="51"/>
+    <w:lsdException w:name="Grid Table 7 Colorful Accent 3" w:uiPriority="52"/>
+    <w:lsdException w:name="Grid Table 1 Light Accent 4" w:uiPriority="46"/>
+    <w:lsdException w:name="Grid Table 2 Accent 4" w:uiPriority="47"/>
+    <w:lsdException w:name="Grid Table 3 Accent 4" w:uiPriority="48"/>
+    <w:lsdException w:name="Grid Table 4 Accent 4" w:uiPriority="49"/>
+    <w:lsdException w:name="Grid Table 5 Dark Accent 4" w:uiPriority="50"/>
+    <w:lsdException w:name="Grid Table 6 Colorful Accent 4" w:uiPriority="51"/>
+    <w:lsdException w:name="Grid Table 7 Colorful Accent 4" w:uiPriority="52"/>
+    <w:lsdException w:name="Grid Table 1 Light Accent 5" w:uiPriority="46"/>
+    <w:lsdException w:name="Grid Table 2 Accent 5" w:uiPriority="47"/>
+    <w:lsdException w:name="Grid Table 3 Accent 5" w:uiPriority="48"/>
+    <w:lsdException w:name="Grid Table 4 Accent 5" w:uiPriority="49"/>
+    <w:lsdException w:name="Grid Table 5 Dark Accent 5" w:uiPriority="50"/>
+    <w:lsdException w:name="Grid Table 6 Colorful Accent 5" w:uiPriority="51"/>
+    <w:lsdException w:name="Grid Table 7 Colorful Accent 5" w:uiPriority="52"/>
+    <w:lsdException w:name="Grid Table 1 Light Accent 6" w:uiPriority="46"/>
+    <w:lsdException w:name="Grid Table 2 Accent 6" w:uiPriority="47"/>
+    <w:lsdException w:name="Grid Table 3 Accent 6" w:uiPriority="48"/>
+    <w:lsdException w:name="Grid Table 4 Accent 6" w:uiPriority="49"/>
+    <w:lsdException w:name="Grid Table 5 Dark Accent 6" w:uiPriority="50"/>
+    <w:lsdException w:name="Grid Table 6 Colorful Accent 6" w:uiPriority="51"/>
+    <w:lsdException w:name="Grid Table 7 Colorful Accent 6" w:uiPriority="52"/>
+    <w:lsdException w:name="List Table 1 Light" w:uiPriority="46"/>
+    <w:lsdException w:name="List Table 2" w:uiPriority="47"/>
+    <w:lsdException w:name="List Table 3" w:uiPriority="48"/>
+    <w:lsdException w:name="List Table 4" w:uiPriority="49"/>
+    <w:lsdException w:name="List Table 5 Dark" w:uiPriority="50"/>
+    <w:lsdException w:name="List Table 6 Colorful" w:uiPriority="51"/>
+    <w:lsdException w:name="List Table 7 Colorful" w:uiPriority="52"/>
+    <w:lsdException w:name="List Table 1 Light Accent 1" w:uiPriority="46"/>
+    <w:lsdException w:name="List Table 2 Accent 1" w:uiPriority="47"/>
+    <w:lsdException w:name="List Table 3 Accent 1" w:uiPriority="48"/>
+    <w:lsdException w:name="List Table 4 Accent 1" w:uiPriority="49"/>
+    <w:lsdException w:name="List Table 5 Dark Accent 1" w:uiPriority="50"/>
+    <w:lsdException w:name="List Table 6 Colorful Accent 1" w:uiPriority="51"/>
+    <w:lsdException w:name="List Table 7 Colorful Accent 1" w:uiPriority="52"/>
+    <w:lsdException w:name="List Table 1 Light Accent 2" w:uiPriority="46"/>
+    <w:lsdException w:name="List Table 2 Accent 2" w:uiPriority="47"/>
+    <w:lsdException w:name="List Table 3 Accent 2" w:uiPriority="48"/>
+    <w:lsdException w:name="List Table 4 Accent 2" w:uiPriority="49"/>
+    <w:lsdException w:name="List Table 5 Dark Accent 2" w:uiPriority="50"/>
+    <w:lsdException w:name="List Table 6 Colorful Accent 2" w:uiPriority="51"/>
+    <w:lsdException w:name="List Table 7 Colorful Accent 2" w:uiPriority="52"/>
+    <w:lsdException w:name="List Table 1 Light Accent 3" w:uiPriority="46"/>
+    <w:lsdException w:name="List Table 2 Accent 3" w:uiPriority="47"/>
+    <w:lsdException w:name="List Table 3 Accent 3" w:uiPriority="48"/>
+    <w:lsdException w:name="List Table 4 Accent 3" w:uiPriority="49"/>
+    <w:lsdException w:name="List Table 5 Dark Accent 3" w:uiPriority="50"/>
+    <w:lsdException w:name="List Table 6 Colorful Accent 3" w:uiPriority="51"/>
+    <w:lsdException w:name="List Table 7 Colorful Accent 3" w:uiPriority="52"/>
+    <w:lsdException w:name="List Table 1 Light Accent 4" w:uiPriority="46"/>
+    <w:lsdException w:name="List Table 2 Accent 4" w:uiPriority="47"/>
+    <w:lsdException w:name="List Table 3 Accent 4" w:uiPriority="48"/>
+    <w:lsdException w:name="List Table 4 Accent 4" w:uiPriority="49"/>
+    <w:lsdException w:name="List Table 5 Dark Accent 4" w:uiPriority="50"/>
+    <w:lsdException w:name="List Table 6 Colorful Accent 4" w:uiPriority="51"/>
+    <w:lsdException w:name="List Table 7 Colorful Accent 4" w:uiPriority="52"/>
+    <w:lsdException w:name="List Table 1 Light Accent 5" w:uiPriority="46"/>
+    <w:lsdException w:name="List Table 2 Accent 5" w:uiPriority="47"/>
+    <w:lsdException w:name="List Table 3 Accent 5" w:uiPriority="48"/>
+    <w:lsdException w:name="List Table 4 Accent 5" w:uiPriority="49"/>
+    <w:lsdException w:name="List Table 5 Dark Accent 5" w:uiPriority="50"/>
+    <w:lsdException w:name="List Table 6 Colorful Accent 5" w:uiPriority="51"/>
+    <w:lsdException w:name="List Table 7 Colorful Accent 5" w:uiPriority="52"/>
+    <w:lsdException w:name="List Table 1 Light Accent 6" w:uiPriority="46"/>
+    <w:lsdException w:name="List Table 2 Accent 6" w:uiPriority="47"/>
+    <w:lsdException w:name="List Table 3 Accent 6" w:uiPriority="48"/>
+    <w:lsdException w:name="List Table 4 Accent 6" w:uiPriority="49"/>
+    <w:lsdException w:name="List Table 5 Dark Accent 6" w:uiPriority="50"/>
+    <w:lsdException w:name="List Table 6 Colorful Accent 6" w:uiPriority="51"/>
+    <w:lsdException w:name="List Table 7 Colorful Accent 6" w:uiPriority="52"/>
+    <w:lsdException w:name="Mention" w:semiHidden="1" w:unhideWhenUsed="1"/>
+    <w:lsdException w:name="Smart Hyperlink" w:semiHidden="1" w:unhideWhenUsed="1"/>
+    <w:lsdException w:name="Hashtag" w:semiHidden="1" w:unhideWhenUsed="1"/>
+    <w:lsdException w:name="Unresolved Mention" w:semiHidden="1" w:unhideWhenUsed="1"/>
+    <w:lsdException w:name="Smart Link" w:semiHidden="1" w:unhideWhenUsed="1"/>
+  </w:latentStyles>
+  <w:style w:type="paragraph" w:default="1" w:styleId="Normal">
+    <w:name w:val="Normal"/>
+    <w:qFormat/>
+  </w:style>
+  <w:style w:type="character" w:default="1" w:styleId="DefaultParagraphFont">
+    <w:name w:val="Default Paragraph Font"/>
+    <w:uiPriority w:val="1"/>
+    <w:semiHidden/>
+    <w:unhideWhenUsed/>
+  </w:style>
+  <w:style w:type="table" w:default="1" w:styleId="TableNormal">
+    <w:name w:val="Normal Table"/>
+    <w:uiPriority w:val="99"/>
+    <w:semiHidden/>
+    <w:unhideWhenUsed/>
+    <w:tblPr>
+      <w:tblInd w:w="0" w:type="dxa"/>
+      <w:tblCellMar>
+        <w:top w:w="0" w:type="dxa"/>
+        <w:left w:w="108" w:type="dxa"/>
+        <w:bottom w:w="0" w:type="dxa"/>
+        <w:right w:w="108" w:type="dxa"/>
+      </w:tblCellMar>
+    </w:tblPr>
+  </w:style>
+  <w:style w:type="numbering" w:default="1" w:styleId="NoList">
+    <w:name w:val="No List"/>
+    <w:uiPriority w:val="99"/>
+    <w:semiHidden/>
+    <w:unhideWhenUsed/>
+  </w:style>
 </w:styles>
+</file>
+
+<file path=word/theme/theme1.xml><?xml version="1.0" encoding="utf-8"?>
+<a:theme xmlns:a="http://schemas.openxmlformats.org/drawingml/2006/main" name="Office Theme">
+  <a:themeElements>
+    <a:clrScheme name="Office">
+      <a:dk1>
+        <a:sysClr val="windowText" lastClr="000000"/>
+      </a:dk1>
+      <a:lt1>
+        <a:sysClr val="window" lastClr="FFFFFF"/>
+      </a:lt1>
+      <a:dk2>
+        <a:srgbClr val="44546A"/>
+      </a:dk2>
+      <a:lt2>
+        <a:srgbClr val="E7E6E6"/>
+      </a:lt2>
+      <a:accent1>
+        <a:srgbClr val="4472C4"/>
+      </a:accent1>
+      <a:accent2>
+        <a:srgbClr val="ED7D31"/>
+      </a:accent2>
+      <a:accent3>
+        <a:srgbClr val="A5A5A5"/>
+      </a:accent3>
+      <a:accent4>
+        <a:srgbClr val="FFC000"/>
+      </a:accent4>
+      <a:accent5>
+        <a:srgbClr val="5B9BD5"/>
+      </a:accent5>
+      <a:accent6>
+        <a:srgbClr val="70AD47"/>
+      </a:accent6>
+      <a:hlink>
+        <a:srgbClr val="0563C1"/>
+      </a:hlink>
+      <a:folHlink>
+        <a:srgbClr val="954F72"/>
+      </a:folHlink>
+    </a:clrScheme>
+    <a:fontScheme name="Office">
+      <a:majorFont>
+        <a:latin typeface="Calibri Light" panose="020F0302020204030204"/>
+        <a:ea typeface=""/>
+        <a:cs typeface=""/>
+        <a:font script="Jpan" typeface="游ゴシック Light"/>
+        <a:font script="Hang" typeface="맑은 고딕"/>
+        <a:font script="Hans" typeface="等线 Light"/>
+        <a:font script="Hant" typeface="新細明體"/>
+        <a:font script="Arab" typeface="Times New Roman"/>
+        <a:font script="Hebr" typeface="Times New Roman"/>
+        <a:font script="Thai" typeface="Angsana New"/>
+        <a:font script="Ethi" typeface="Nyala"/>
+        <a:font script="Beng" typeface="Vrinda"/>
+        <a:font script="Gujr" typeface="Shruti"/>
+        <a:font script="Khmr" typeface="MoolBoran"/>
+        <a:font script="Knda" typeface="Tunga"/>
+        <a:font script="Guru" typeface="Raavi"/>
+        <a:font script="Cans" typeface="Euphemia"/>
+        <a:font script="Cher" typeface="Plantagenet Cherokee"/>
+        <a:font script="Yiii" typeface="Microsoft Yi Baiti"/>
+        <a:font script="Tibt" typeface="Microsoft Himalaya"/>
+        <a:font script="Thaa" typeface="MV Boli"/>
+        <a:font script="Deva" typeface="Mangal"/>
+        <a:font script="Telu" typeface="Gautami"/>
+        <a:font script="Taml" typeface="Latha"/>
+        <a:font script="Syrc" typeface="Estrangelo Edessa"/>
+        <a:font script="Orya" typeface="Kalinga"/>
+        <a:font script="Mlym" typeface="Kartika"/>
+        <a:font script="Laoo" typeface="DokChampa"/>
+        <a:font script="Sinh" typeface="Iskoola Pota"/>
+        <a:font script="Mong" typeface="Mongolian Baiti"/>
+        <a:font script="Viet" typeface="Times New Roman"/>
+        <a:font script="Uigh" typeface="Microsoft Uighur"/>
+        <a:font script="Geor" typeface="Sylfaen"/>
+        <a:font script="Armn" typeface="Arial"/>
+        <a:font script="Bugi" typeface="Leelawadee UI"/>
+        <a:font script="Bopo" typeface="Microsoft JhengHei"/>
+        <a:font script="Java" typeface="Javanese Text"/>
+        <a:font script="Lisu" typeface="Segoe UI"/>
+        <a:font script="Mymr" typeface="Myanmar Text"/>
+        <a:font script="Nkoo" typeface="Ebrima"/>
+        <a:font script="Olck" typeface="Nirmala UI"/>
+        <a:font script="Osma" typeface="Ebrima"/>
+        <a:font script="Phag" typeface="Phagspa"/>
+        <a:font script="Syrn" typeface="Estrangelo Edessa"/>
+        <a:font script="Syrj" typeface="Estrangelo Edessa"/>
+        <a:font script="Syre" typeface="Estrangelo Edessa"/>
+        <a:font script="Sora" typeface="Nirmala UI"/>
+        <a:font script="Tale" typeface="Microsoft Tai Le"/>
+        <a:font script="Talu" typeface="Microsoft New Tai Lue"/>
+        <a:font script="Tfng" typeface="Ebrima"/>
+      </a:majorFont>
+      <a:minorFont>
+        <a:latin typeface="Calibri" panose="020F0502020204030204"/>
+        <a:ea typeface=""/>
+        <a:cs typeface=""/>
+        <a:font script="Jpan" typeface="游明朝"/>
+        <a:font script="Hang" typeface="맑은 고딕"/>
+        <a:font script="Hans" typeface="等线"/>
+        <a:font script="Hant" typeface="新細明體"/>
+        <a:font script="Arab" typeface="Arial"/>
+        <a:font script="Hebr" typeface="Arial"/>
+        <a:font script="Thai" typeface="Cordia New"/>
+        <a:font script="Ethi" typeface="Nyala"/>
+        <a:font script="Beng" typeface="Vrinda"/>
+        <a:font script="Gujr" typeface="Shruti"/>
+        <a:font script="Khmr" typeface="DaunPenh"/>
+        <a:font script="Knda" typeface="Tunga"/>
+        <a:font script="Guru" typeface="Raavi"/>
+        <a:font script="Cans" typeface="Euphemia"/>
+        <a:font script="Cher" typeface="Plantagenet Cherokee"/>
+        <a:font script="Yiii" typeface="Microsoft Yi Baiti"/>
+        <a:font script="Tibt" typeface="Microsoft Himalaya"/>
+        <a:font script="Thaa" typeface="MV Boli"/>
+        <a:font script="Deva" typeface="Mangal"/>
+        <a:font script="Telu" typeface="Gautami"/>
+        <a:font script="Taml" typeface="Latha"/>
+        <a:font script="Syrc" typeface="Estrangelo Edessa"/>
+        <a:font script="Orya" typeface="Kalinga"/>
+        <a:font script="Mlym" typeface="Kartika"/>
+        <a:font script="Laoo" typeface="DokChampa"/>
+        <a:font script="Sinh" typeface="Iskoola Pota"/>
+        <a:font script="Mong" typeface="Mongolian Baiti"/>
+        <a:font script="Viet" typeface="Arial"/>
+        <a:font script="Uigh" typeface="Microsoft Uighur"/>
+        <a:font script="Geor" typeface="Sylfaen"/>
+        <a:font script="Armn" typeface="Arial"/>
+        <a:font script="Bugi" typeface="Leelawadee UI"/>
+        <a:font script="Bopo" typeface="Microsoft JhengHei"/>
+        <a:font script="Java" typeface="Javanese Text"/>
+        <a:font script="Lisu" typeface="Segoe UI"/>
+        <a:font script="Mymr" typeface="Myanmar Text"/>
+        <a:font script="Nkoo" typeface="Ebrima"/>
+        <a:font script="Olck" typeface="Nirmala UI"/>
+        <a:font script="Osma" typeface="Ebrima"/>
+        <a:font script="Phag" typeface="Phagspa"/>
+        <a:font script="Syrn" typeface="Estrangelo Edessa"/>
+        <a:font script="Syrj" typeface="Estrangelo Edessa"/>
+        <a:font script="Syre" typeface="Estrangelo Edessa"/>
+        <a:font script="Sora" typeface="Nirmala UI"/>
+        <a:font script="Tale" typeface="Microsoft Tai Le"/>
+        <a:font script="Talu" typeface="Microsoft New Tai Lue"/>
+        <a:font script="Tfng" typeface="Ebrima"/>
+      </a:minorFont>
+    </a:fontScheme>
+    <a:fmtScheme name="Office">
+      <a:fillStyleLst>
+        <a:solidFill>
+          <a:schemeClr val="phClr"/>
+        </a:solidFill>
+        <a:gradFill rotWithShape="1">
+          <a:gsLst>
+            <a:gs pos="0">
+              <a:schemeClr val="phClr">
+                <a:lumMod val="110000"/>
+                <a:satMod val="105000"/>
+                <a:tint val="67000"/>
+              </a:schemeClr>
+            </a:gs>
+            <a:gs pos="50000">
+              <a:schemeClr val="phClr">
+                <a:lumMod val="105000"/>
+                <a:satMod val="103000"/>
+                <a:tint val="73000"/>
+              </a:schemeClr>
+            </a:gs>
+            <a:gs pos="100000">
+              <a:schemeClr val="phClr">
+                <a:lumMod val="105000"/>
+                <a:satMod val="109000"/>
+                <a:tint val="81000"/>
+              </a:schemeClr>
+            </a:gs>
+          </a:gsLst>
+          <a:lin ang="5400000" scaled="0"/>
+        </a:gradFill>
+        <a:gradFill rotWithShape="1">
+          <a:gsLst>
+            <a:gs pos="0">
+              <a:schemeClr val="phClr">
+                <a:satMod val="103000"/>
+                <a:lumMod val="102000"/>
+                <a:tint val="94000"/>
+              </a:schemeClr>
+            </a:gs>
+            <a:gs pos="50000">
+              <a:schemeClr val="phClr">
+                <a:satMod val="110000"/>
+                <a:lumMod val="100000"/>
+                <a:shade val="100000"/>
+              </a:schemeClr>
+            </a:gs>
+            <a:gs pos="100000">
+              <a:schemeClr val="phClr">
+                <a:lumMod val="99000"/>
+                <a:satMod val="120000"/>
+                <a:shade val="78000"/>
+              </a:schemeClr>
+            </a:gs>
+          </a:gsLst>
+          <a:lin ang="5400000" scaled="0"/>
+        </a:gradFill>
+      </a:fillStyleLst>
+      <a:lnStyleLst>
+        <a:ln w="6350" cap="flat" cmpd="sng" algn="ctr">
+          <a:solidFill>
+            <a:schemeClr val="phClr"/>
+          </a:solidFill>
+          <a:prstDash val="solid"/>
+          <a:miter lim="800000"/>
+        </a:ln>
+        <a:ln w="12700" cap="flat" cmpd="sng" algn="ctr">
+          <a:solidFill>
+            <a:schemeClr val="phClr"/>
+          </a:solidFill>
+          <a:prstDash val="solid"/>
+          <a:miter lim="800000"/>
+        </a:ln>
+        <a:ln w="19050" cap="flat" cmpd="sng" algn="ctr">
+          <a:solidFill>
+            <a:schemeClr val="phClr"/>
+          </a:solidFill>
+          <a:prstDash val="solid"/>
+          <a:miter lim="800000"/>
+        </a:ln>
+      </a:lnStyleLst>
+      <a:effectStyleLst>
+        <a:effectStyle>
+          <a:effectLst/>
+        </a:effectStyle>
+        <a:effectStyle>
+          <a:effectLst/>
+        </a:effectStyle>
+        <a:effectStyle>
+          <a:effectLst>
+            <a:outerShdw blurRad="57150" dist="19050" dir="5400000" algn="ctr" rotWithShape="0">
+              <a:srgbClr val="000000">
+                <a:alpha val="63000"/>
+              </a:srgbClr>
+            </a:outerShdw>
+          </a:effectLst>
+        </a:effectStyle>
+      </a:effectStyleLst>
+      <a:bgFillStyleLst>
+        <a:solidFill>
+          <a:schemeClr val="phClr"/>
+        </a:solidFill>
+        <a:solidFill>
+          <a:schemeClr val="phClr">
+            <a:tint val="95000"/>
+            <a:satMod val="170000"/>
+          </a:schemeClr>
+        </a:solidFill>
+        <a:gradFill rotWithShape="1">
+          <a:gsLst>
+            <a:gs pos="0">
+              <a:schemeClr val="phClr">
+                <a:tint val="93000"/>
+                <a:satMod val="150000"/>
+                <a:shade val="98000"/>
+                <a:lumMod val="102000"/>
+              </a:schemeClr>
+            </a:gs>
+            <a:gs pos="50000">
+              <a:schemeClr val="phClr">
+                <a:tint val="98000"/>
+                <a:satMod val="130000"/>
+                <a:shade val="90000"/>
+                <a:lumMod val="103000"/>
+              </a:schemeClr>
+            </a:gs>
+            <a:gs pos="100000">
+              <a:schemeClr val="phClr">
+                <a:shade val="63000"/>
+                <a:satMod val="120000"/>
+              </a:schemeClr>
+            </a:gs>
+          </a:gsLst>
+          <a:lin ang="5400000" scaled="0"/>
+        </a:gradFill>
+      </a:bgFillStyleLst>
+    </a:fmtScheme>
+  </a:themeElements>
+  <a:objectDefaults/>
+  <a:extraClrSchemeLst/>
+  <a:extLst>
+    <a:ext uri="{05A4C25C-085E-4340-85A3-A5531E510DB2}">
+      <thm15:themeFamily xmlns:thm15="http://schemas.microsoft.com/office/thememl/2012/main" name="Office Theme" id="{62F939B6-93AF-4DB8-9C6B-D6C7DFDC589F}" vid="{4A3C46E8-61CC-4603-A589-7422A47A8E4A}"/>
+    </a:ext>
+  </a:extLst>
+</a:theme>
 </file>
</xml_diff>